<commit_message>
H28 cont.: manuscript 5,025 -> 5,035 (pending-10 note)
</commit_message>
<xml_diff>
--- a/RCDome_manuscript_governance_V027.docx
+++ b/RCDome_manuscript_governance_V027.docx
@@ -8800,7 +8800,7 @@
           <w:rFonts w:asciiTheme="majorHAnsi" w:hAnsiTheme="majorHAnsi" w:cstheme="majorHAnsi"/>
           <w:szCs w:val="24"/>
         </w:rPr>
-        <w:t>Of the 21,568 unique gene-RCD pairs, 9,785 (45.4%) were classified as mechanistically involved (YES) and 11,783 (54.6%) as not mechanistically involved (NO). Among the mechanistically-involved pairs, 469 (4.8%) were executors, genes that directly execute the death pathway, and 9,311 (95.2%) were regulators that promote or inhibit it. Across the 21,568 unique gene-RCD pairs, roles resolved as 9,311 regulators, 469 executors, 5 markers, and 11,783 with an unresolved role; direction (across all role-resolved associations) resolved as PROMOTES for 5,025, PROTECTS for 4,755, and UNCLEAR for 5, a near-even pro-death versus anti-death balance. Overall, 5,826 of the 9,265 genes represented in RCDome (62.9%) had at least one mechanistically involved association. Classification yield varied markedly by source database: the fraction of associations classified as mechanistically involved ranged from 21.6% (XDeathDB) to 86.5% (WikiPathways) (Supplementary Figure S3).</w:t>
+        <w:t>Of the 21,568 unique gene-RCD pairs, 9,785 (45.4%) were classified as mechanistically involved (YES) and 11,783 (54.6%) as not mechanistically involved (NO). Among the mechanistically-involved pairs, 469 (4.8%) were executors, genes that directly execute the death pathway, and 9,311 (95.2%) were regulators that promote or inhibit it. Across the 21,568 unique gene-RCD pairs, roles resolved as 9,311 regulators, 469 executors, 5 markers, and 11,783 with an unresolved role; direction (across all role-resolved associations) resolved as PROMOTES for 5,035, PROTECTS for 4,755, and UNCLEAR for 5, a near-even pro-death versus anti-death balance. Overall, 5,826 of the 9,265 genes represented in RCDome (62.9%) had at least one mechanistically involved association. Classification yield varied markedly by source database: the fraction of associations classified as mechanistically involved ranged from 21.6% (XDeathDB) to 86.5% (WikiPathways) (Supplementary Figure S3).</w:t>
       </w:r>
     </w:p>
     <w:p>
@@ -9412,7 +9412,7 @@
           <w:rFonts w:asciiTheme="majorHAnsi" w:hAnsiTheme="majorHAnsi" w:cstheme="majorHAnsi"/>
           <w:szCs w:val="24"/>
         </w:rPr>
-        <w:t>The direction of regulation is nearly balanced, 5,025 promoters versus 4,755 protectors (across all role-resolved associations), consistent with death as a decision that cells weigh in both directions, not a one-way cascade. And 62.9% of the 9,265 genes have at least one mechanistically-involved association, confirming that RCD is woven through a large fraction of the human genome (Figure 3C). Taken together, these numbers change how the field should be read: the core of regulated cell death is small, and most of the compiled network is regulation of death, not execution of it (Figure 3D). Gene coverage is highly heterogeneous across the 53 entities, from Apoptosis (5,897 unique genes) and Autophagy (4,634 unique genes) to Pyronecrosis (1 gene) (Figure 4). Where a subtype carries more genes than its parent, Autosis (1,105 genes) against Autophagy-dependent cell death (110), the difference reflects the depth of database indexing, not ontological inheritance; parent–child gene inventories are not expected to be nested subsets.</w:t>
+        <w:t>The direction of regulation is nearly balanced, 5,035 promoters (10 pairs pending human curator verdicts) versus 4,755 protectors (across all role-resolved associations), consistent with death as a decision that cells weigh in both directions, not a one-way cascade. And 62.9% of the 9,265 genes have at least one mechanistically-involved association, confirming that RCD is woven through a large fraction of the human genome. Taken together, these numbers change how the field should be read: the core of regulated cell death is small, and most of the compiled network is regulation of death, not execution of it (Figure 3D). Gene coverage is highly heterogeneous across the 53 entities, from Apoptosis (5,897 unique genes) and Autophagy (4,634 unique genes) to Pyronecrosis (1 gene) (Figure 4). Where a subtype carries more genes than its parent, Autosis (1,105 genes) against Autophagy-dependent cell death (110), the difference reflects the depth of database indexing, not ontological inheritance; parent–child gene inventories are not expected to be nested subsets.</w:t>
       </w:r>
     </w:p>
     <w:p>
@@ -10733,7 +10733,7 @@
           <w:bCs/>
           <w:szCs w:val="24"/>
         </w:rPr>
-        <w:t>(A) Role distribution across the 21,568 unique gene-RCD pairs classified by the DeepSeek chain-of-thought run: 11,783 unresolved, 9,311 regulators, 469 executors, and 5 markers. (B) Mechanistically-involved fraction by ontological level (L1 modalities, L2 subtypes, L3 triggers, L4 Functional/contextual categories, L5 Generic/umbrella/taxon concepts); the modalities carry the densest mechanistic signal (63.5%) while the Functional/contextual categories (L4) are the most dilute (22.9%), with the Generic/umbrella/taxon concepts at 30.2%. (C) Direction across all role-resolved associations: 5,025 promote and 4,755 protect (among the 9,311 regulators, 4,556 promote and 4,755 protect), a near-even balance. (D) The executor core (orange, 469) drawn area-proportionally inside the regulatory network (blue, 9,311) and the unresolved associations (grey, 11,783), illustrating that the death-executing machinery is small and the regulatory network is vast.</w:t>
+        <w:t>(A) Role distribution across the 21,568 unique gene-RCD pairs classified by the DeepSeek chain-of-thought run: 11,783 unresolved, 9,311 regulators, 469 executors, and 5 markers. (B) Mechanistically-involved fraction by ontological level (L1 modalities, L2 subtypes, L3 triggers, L4 Functional/contextual categories, L5 Generic/umbrella/taxon concepts); the modalities carry the densest mechanistic signal (63.5%) while the Functional/contextual categories (L4) are the most dilute (22.9%), with the Generic/umbrella/taxon concepts at 30.2%. (C) Direction across all role-resolved associations: 5,035 promote and 4,755 protect (among the 9,311 regulators, 4,556 promote and 4,755 protect), a near-even balance. (D) The executor core (orange, 469) drawn area-proportionally inside the regulatory network (blue, 9,311) and the unresolved associations (grey, 11,783), illustrating that the death-executing machinery is small and the regulatory network is vast.</w:t>
       </w:r>
     </w:p>
     <w:p>

</xml_diff>

<commit_message>
H33: Ferroptosis benchmark denominator = V013 snapshot 1,715 (not 1,724)
</commit_message>
<xml_diff>
--- a/RCDome_manuscript_governance_V027.docx
+++ b/RCDome_manuscript_governance_V027.docx
@@ -6327,7 +6327,7 @@
           <w:bCs/>
           <w:szCs w:val="24"/>
         </w:rPr>
-        <w:t>Three RCD forms were selected to span the range of gene-set complexity in the RCDome matrix: Ferroptosis (1,724 HGNC-validated genes; a large, mechanistically well-characterized form), Cuproptosis (77 genes; a moderately studied, mechanistically distinct form), and Triaptosis (3 genes; a newly recognized form with minimal literature). Each form's target gene list was extracted from the unified gene-RCD matrix and served as the closed allow-list for that form's extraction (</w:t>
+        <w:t>Three RCD forms were selected to span the range of gene-set complexity in the RCDome matrix: Ferroptosis (1,715 HGNC-validated genes at the V013 benchmark snapshot; 1,724 in the current V027 matrix; a large, mechanistically well-characterized form), Cuproptosis (77 genes; a moderately studied, mechanistically distinct form), and Triaptosis (3 genes; a newly recognized form with minimal literature). Each form's target gene list was extracted from the unified gene-RCD matrix and served as the closed allow-list for that form's extraction (</w:t>
       </w:r>
       <w:r>
         <w:rPr>
@@ -8459,7 +8459,7 @@
           <w:rFonts w:asciiTheme="majorHAnsi" w:hAnsiTheme="majorHAnsi" w:cstheme="majorHAnsi"/>
           <w:szCs w:val="24"/>
         </w:rPr>
-        <w:t xml:space="preserve">To determine the production search depth, we measured how Elicit's paper yield scales with the maxResults parameter across a five-point series using Ferroptosis (1,724 allow-list genes) as the test form. Elicit's API documentation specifies a </w:t>
+        <w:t xml:space="preserve">To determine the production search depth, we measured how Elicit's paper yield scales with the maxResults parameter across a five-point series using Ferroptosis (1,715 allow-list genes at the V013 benchmark snapshot) as the test form. Elicit's API documentation specifies a </w:t>
       </w:r>
       <w:r>
         <w:rPr>

</xml_diff>

<commit_message>
H33 revision: align Ferroptosis benchmark allow-list to V027 truth (1,724)
</commit_message>
<xml_diff>
--- a/RCDome_manuscript_governance_V027.docx
+++ b/RCDome_manuscript_governance_V027.docx
@@ -6327,7 +6327,7 @@
           <w:bCs/>
           <w:szCs w:val="24"/>
         </w:rPr>
-        <w:t>Three RCD forms were selected to span the range of gene-set complexity in the RCDome matrix: Ferroptosis (1,715 HGNC-validated genes at the V013 benchmark snapshot; 1,724 in the current V027 matrix; a large, mechanistically well-characterized form), Cuproptosis (77 genes; a moderately studied, mechanistically distinct form), and Triaptosis (3 genes; a newly recognized form with minimal literature). Each form's target gene list was extracted from the unified gene-RCD matrix and served as the closed allow-list for that form's extraction (</w:t>
+        <w:t>Three RCD forms were selected to span the range of gene-set complexity in the RCDome matrix: Ferroptosis (1,724 HGNC-validated genes; a large, mechanistically well-characterized form), Cuproptosis (77 genes; a moderately studied, mechanistically distinct form), and Triaptosis (3 genes; a newly recognized form with minimal literature). Each form's target gene list was extracted from the unified gene-RCD matrix and served as the closed allow-list for that form's extraction (</w:t>
       </w:r>
       <w:r>
         <w:rPr>
@@ -8459,7 +8459,7 @@
           <w:rFonts w:asciiTheme="majorHAnsi" w:hAnsiTheme="majorHAnsi" w:cstheme="majorHAnsi"/>
           <w:szCs w:val="24"/>
         </w:rPr>
-        <w:t xml:space="preserve">To determine the production search depth, we measured how Elicit's paper yield scales with the maxResults parameter across a five-point series using Ferroptosis (1,715 allow-list genes at the V013 benchmark snapshot) as the test form. Elicit's API documentation specifies a </w:t>
+        <w:t xml:space="preserve">To determine the production search depth, we measured how Elicit's paper yield scales with the maxResults parameter across a five-point series using Ferroptosis (1,724 allow-list genes) as the test form. Elicit's API documentation specifies a </w:t>
       </w:r>
       <w:r>
         <w:rPr>

</xml_diff>

<commit_message>
H47: 3-way taxonomy (20 association / 6 omics / 2 PPI) across manuscript + S2
</commit_message>
<xml_diff>
--- a/RCDome_manuscript_governance_V027.docx
+++ b/RCDome_manuscript_governance_V027.docx
@@ -1181,8 +1181,7 @@
           <w:rFonts w:asciiTheme="majorHAnsi" w:hAnsiTheme="majorHAnsi" w:cstheme="majorHAnsi"/>
           <w:szCs w:val="24"/>
         </w:rPr>
-        <w:lastRenderedPageBreak/>
-        <w:t>Information (NCBI) + DeepSeek Abstract Validation), Layer 2 (Europe PMC + DeepSeek Full-Text Recovery), Layer 3 (Europe PMC XML Deep Retrieval-Augmented Generation (RAG)), and Layer 4 (Elicit Independent Literature Mining). This layered architecture ensures that original database claims are preserved intact. The platform's development followed a four-phase strategy: (i) establishment of a canonicalized RCD-related entity vocabulary through systematic literature and database discovery; (ii) multi-channel gene compilation from 20 source resources organized into four compilation channels (A through D), with a fifth validation/literature-mining channel (E) added at validation; (iii) integration into a unified, traceability-compliant gene-RCD association matrix; and (iv) deployment as a publicly available interactive web platform.</w:t>
+        <w:t>Information (NCBI) + DeepSeek Abstract Validation), Layer 2 (Europe PMC + DeepSeek Full-Text Recovery), Layer 3 (Europe PMC XML Deep Retrieval-Augmented Generation (RAG)), and Layer 4 (Elicit Independent Literature Mining). This layered architecture ensures that original database claims are preserved intact. The platform's development followed a four-phase strategy: (i) establishment of a canonicalized RCD-related entity vocabulary through systematic literature and database discovery; (ii) multi-channel gene compilation from 20 association databases and resources organized into four compilation channels (A through D), with a fifth validation/literature-mining channel (E) added at validation; (iii) integration into a unified, traceability-compliant gene-RCD association matrix; and (iv) deployment as a publicly available interactive web platform.</w:t>
       </w:r>
     </w:p>
     <w:p>
@@ -1326,7 +1325,7 @@
           <w:rFonts w:asciiTheme="majorHAnsi" w:hAnsiTheme="majorHAnsi" w:cstheme="majorHAnsi"/>
           <w:szCs w:val="24"/>
         </w:rPr>
-        <w:t>During database discovery, newly emerging RCD forms were encountered, demanding systematic expansion. We executed a multi-layered literature and database surveillance strategy: (a) forward-citation tracking of NCCD 2018 article {Galluzzi, 2018 #782025} to identify post-consensus RCD forms; (b) PubMed systematic searches using the "-ptosis" and "-osis" suffix patterns combined with "cell death" terminology; (c) surveillance of bioRxiv and medRxiv preprints (2024–2026); and (d) cross-referencing against the RCD form inventories of all 20 source databases and resources (Supplementary Table S2).</w:t>
+        <w:t>During database discovery, newly emerging RCD forms were encountered, demanding systematic expansion. We executed a multi-layered literature and database surveillance strategy: (a) forward-citation tracking of NCCD 2018 article {Galluzzi, 2018 #782025} to identify post-consensus RCD forms; (b) PubMed systematic searches using the "-ptosis" and "-osis" suffix patterns combined with "cell death" terminology; (c) surveillance of bioRxiv and medRxiv preprints (2024–2026); and (d) cross-referencing against the RCD form inventories of all 20 association databases and resources (Supplementary Table S2).</w:t>
       </w:r>
     </w:p>
     <w:p>
@@ -3791,7 +3790,7 @@
         <w:t xml:space="preserve">. </w:t>
       </w:r>
       <w:r>
-        <w:t>Both terms were evaluated against the same framework. Independently of their biological status, neither term is present in any of the 20 source databases and resources used in the compilation (ruptosis entered specialized databases only from October 2026, after the matrix data freeze), so under the no-invented-names rule (every RCDome entity originates from at least one source database's published terminology), neither could be admitted as a compendium entity. They are nevertheless ruled out explicitly, on both database-absence and biological-gate grounds, rather than left unaddressed:</w:t>
+        <w:t>Both terms were evaluated against the same framework. Independently of their biological status, neither term is present in any of the 20 association databases and resources used in the compilation (ruptosis entered specialized databases only from October 2026, after the matrix data freeze), so under the no-invented-names rule (every RCDome entity originates from at least one source database's published terminology), neither could be admitted as a compendium entity. They are nevertheless ruled out explicitly, on both database-absence and biological-gate grounds, rather than left unaddressed:</w:t>
       </w:r>
     </w:p>
     <w:p>
@@ -4023,7 +4022,7 @@
           <w:rFonts w:asciiTheme="majorHAnsi" w:hAnsiTheme="majorHAnsi" w:cstheme="majorHAnsi"/>
           <w:szCs w:val="24"/>
         </w:rPr>
-        <w:t>The final RCD form vocabulary consolidates 62 original name strings from 20 source resources into 53 RCD-related entities through 9 synonym-merge groups (11 name eliminations, 2 split names). All 53 RCD-related entities carry gene-level evidence in the unified matrix (</w:t>
+        <w:t>The final RCD form vocabulary consolidates 62 original name strings from 20 association databases and resources into 53 RCD-related entities through 9 synonym-merge groups (11 name eliminations, 2 split names). All 53 RCD-related entities carry gene-level evidence in the unified matrix (</w:t>
       </w:r>
       <w:r>
         <w:rPr>
@@ -6861,7 +6860,7 @@
           <w:rFonts w:asciiTheme="majorHAnsi" w:hAnsiTheme="majorHAnsi" w:cstheme="majorHAnsi"/>
           <w:szCs w:val="24"/>
         </w:rPr>
-        <w:t>RCDome integrates all 53 RCD-related entities from 20 source resources into a single, queryable resource encompassing 9,265 HGNC-validated human genes and 22,473 individual gene-RCD claimed associations. Every association is traceable to its source database and verified against the published literature through an automated evidence-scoring framework that assigns confidence tiers (CT1–CT4). At its core lies a curated controlled vocabulary of 53 RCD-related entities, consolidated from 62 original name strings across 20 source resources through systematic literature and database surveillance. Supplementary Table S9 compares RCDome against FerrDB v3 and RCDdb across the resources' key features. The complete codebase is available for reproducibility and independent audit of every step from database extraction to evidence verification.</w:t>
+        <w:t>RCDome integrates all 53 RCD-related entities from 20 association databases and resources into a single, queryable resource encompassing 9,265 HGNC-validated human genes and 22,473 individual gene-RCD claimed associations. Every association is traceable to its source database and verified against the published literature through an automated evidence-scoring framework that assigns confidence tiers (CT1–CT4). At its core lies a curated controlled vocabulary of 53 RCD-related entities, consolidated from 62 original name strings across 20 association databases and resources through systematic literature and database surveillance. Supplementary Table S9 compares RCDome against FerrDB v3 and RCDdb across the resources' key features. The complete codebase is available for reproducibility and independent audit of every step from database extraction to evidence verification.</w:t>
       </w:r>
     </w:p>
     <w:p>
@@ -7140,7 +7139,7 @@
           <w:rFonts w:asciiTheme="majorHAnsi" w:hAnsiTheme="majorHAnsi" w:cstheme="majorHAnsi"/>
           <w:szCs w:val="24"/>
         </w:rPr>
-        <w:t>. For completeness, TCGA, GEO, CPTAC, CCLE/GDSC/DepMap, STRING, and BioGRID are annotation/PPI sources, not gene extraction sources.</w:t>
+        <w:t>. For completeness, the 6 omics annotation resources (TCGA, GEO, CPTAC, CCLE, GDSC, DepMap) and the 2 PPI annotation resources (STRING, BioGRID) are annotation resources, not gene-extraction sources.</w:t>
       </w:r>
     </w:p>
     <w:p>
@@ -7356,8 +7355,7 @@
           <w:rFonts w:asciiTheme="majorHAnsi" w:hAnsiTheme="majorHAnsi" w:cstheme="majorHAnsi"/>
           <w:szCs w:val="24"/>
         </w:rPr>
-        <w:lastRenderedPageBreak/>
-        <w:t xml:space="preserve">six omic-annotation resources (TCGA, GEO, CPTAC, CCLE, GDSC, DepMap), supplemented by the AI-assisted Elicit extraction (20 source resources, </w:t>
+        <w:t xml:space="preserve">six omic-annotation resources (TCGA, GEO, CPTAC, CCLE, GDSC, DepMap), supplemented by the AI-assisted Elicit extraction (20 association databases and resources, </w:t>
       </w:r>
       <w:r>
         <w:rPr>
@@ -9287,7 +9285,7 @@
           <w:rFonts w:asciiTheme="majorHAnsi" w:hAnsiTheme="majorHAnsi" w:cstheme="majorHAnsi"/>
           <w:szCs w:val="24"/>
         </w:rPr>
-        <w:t xml:space="preserve">RCDome does not replace FerrDB v3, RCDdb, or any of the 20 source resources from which it draws. It integrates their gene-RCD pair associations into a single, traceable context where every claim can be verified against its source. The compendium transforms distributed, heterogeneous knowledge, 62 original name strings across 20 resources, into a unified resource of 53 RCD-related entities, each with gene-level evidence, source provenance, and a seven-class mechanistic classification. The name RCDome reflects the architectural intent: a structure that provides comprehensive overhead coverage, unified enclosure, and a single vantage point from which to survey the entire RCD landscape. </w:t>
+        <w:t xml:space="preserve">RCDome does not replace FerrDB v3, RCDdb, or any of the 20 association databases and resources from which it draws. It integrates their gene-RCD pair associations into a single, traceable context where every claim can be verified against its source. The compendium transforms distributed, heterogeneous knowledge, 62 original name strings across 20 resources, into a unified resource of 53 RCD-related entities, each with gene-level evidence, source provenance, and a seven-class mechanistic classification. The name RCDome reflects the architectural intent: a structure that provides comprehensive overhead coverage, unified enclosure, and a single vantage point from which to survey the entire RCD landscape. </w:t>
       </w:r>
     </w:p>
     <w:p>
@@ -9783,7 +9781,7 @@
         </w:rPr>
       </w:pPr>
       <w:r>
-        <w:t>The RCDome compendium matrix (Dataset S1; 22,473 rows × 83 columns; freeze date 2026-10-15), extraction pipeline, and the RCDome web application source code are available at https://github.com/BioCancerInformatics/RCDome. The 20 source databases and resources are publicly accessible at the URLs listed in Supplementary Table S2. All extraction scripts, integration code, and the RCDome Shiny application source code are available at https://github.com/BioCancerInformatics/RCDome. The complete extraction pipeline is orchestrated by master_extract.py, which executes all 21 channel_*.py extraction scripts in sequence (21 of the 43 scripts in the full pipeline catalog, Table S10), producing timestamped, traceability-compliant CSV outputs. The repository also includes automated smoke tests with continuous integration that verify the mechanistic classification mapping, the chain-of-thought governance rules, and the benchmark scoring.https://github.com/BioCancerInformatics/RCDomehttps://github.com/BioCancerInformatics/RCDomehttps://github.com/BioCancerInformatics/RCDomehttps://github.com/BioCancerInformatics/RCDomehttps://github.com/BioCancerInformatics/RCDomehttps://github.com/BioCancerInformatics/RCDome</w:t>
+        <w:t>The RCDome compendium matrix (Dataset S1; 22,473 rows × 83 columns; freeze date 2026-10-15), extraction pipeline, and the RCDome web application source code are available at https://github.com/BioCancerInformatics/RCDome. The 20 association databases and resources are publicly accessible at the URLs listed in Supplementary Table S2. All extraction scripts, integration code, and the RCDome Shiny application source code are available at https://github.com/BioCancerInformatics/RCDome. The complete extraction pipeline is orchestrated by master_extract.py, which executes all 21 channel_*.py extraction scripts in sequence (21 of the 43 scripts in the full pipeline catalog, Table S10), producing timestamped, traceability-compliant CSV outputs. The repository also includes automated smoke tests with continuous integration that verify the mechanistic classification mapping, the chain-of-thought governance rules, and the benchmark scoring.https://github.com/BioCancerInformatics/RCDomehttps://github.com/BioCancerInformatics/RCDomehttps://github.com/BioCancerInformatics/RCDomehttps://github.com/BioCancerInformatics/RCDomehttps://github.com/BioCancerInformatics/RCDomehttps://github.com/BioCancerInformatics/RCDome</w:t>
       </w:r>
       <w:r/>
       <w:hyperlink r:id="rId42" w:history="1">

</xml_diff>

<commit_message>
Manuscript: green-highlight all call-outs (Figure/Dataset/Note/Table/Prompt), Figure 3C cited in Results, Rodrigues 2025 normalized
</commit_message>
<xml_diff>
--- a/RCDome_manuscript_governance_V027.docx
+++ b/RCDome_manuscript_governance_V027.docx
@@ -421,7 +421,16 @@
         <w:spacing w:after="0" w:line="240" w:lineRule="auto"/>
       </w:pPr>
       <w:r>
-        <w:t>Number of Datasets: 01 (Dataset S1, the unified matrix)</w:t>
+        <w:t>Number of Datasets: 01 (</w:t>
+      </w:r>
+      <w:r>
+        <w:rPr>
+          <w:highlight w:val="green"/>
+        </w:rPr>
+        <w:t xml:space="preserve">Dataset S1</w:t>
+      </w:r>
+      <w:r>
+        <w:t xml:space="preserve">, the unified matrix)</w:t>
       </w:r>
     </w:p>
     <w:p>
@@ -1162,7 +1171,22 @@
           <w:rFonts w:asciiTheme="majorHAnsi" w:hAnsiTheme="majorHAnsi" w:cstheme="majorHAnsi"/>
           <w:szCs w:val="24"/>
         </w:rPr>
-        <w:t xml:space="preserve">RCDome was conceived as a comprehensive, gene-centric, multi-source knowledge platform encompassing the RCD-related entities represented in the governed source universe (Figure 1). The platform follows a layered, database-centered strategy in which each successive validation layer builds upon the database compilation foundation without overwriting earlier results: Layer 0 (Database Compilation), Layer 1 (National Center for Biotechnology </w:t>
+        <w:t>RCDome was conceived as a comprehensive, gene-centric, multi-source knowledge platform encompassing the RCD-related entities represented in the governed source universe (</w:t>
+      </w:r>
+      <w:r>
+        <w:rPr>
+          <w:rFonts w:asciiTheme="majorHAnsi" w:hAnsiTheme="majorHAnsi" w:cstheme="majorHAnsi"/>
+          <w:szCs w:val="24"/>
+          <w:highlight w:val="green"/>
+        </w:rPr>
+        <w:t xml:space="preserve">Figure 1</w:t>
+      </w:r>
+      <w:r>
+        <w:rPr>
+          <w:rFonts w:asciiTheme="majorHAnsi" w:hAnsiTheme="majorHAnsi" w:cstheme="majorHAnsi"/>
+          <w:szCs w:val="24"/>
+        </w:rPr>
+        <w:t xml:space="preserve">). The platform follows a layered, database-centered strategy in which each successive validation layer builds upon the database compilation foundation without overwriting earlier results: Layer 0 (Database Compilation), Layer 1 (National Center for Biotechnology </w:t>
       </w:r>
       <w:r>
         <w:rPr>
@@ -1314,7 +1338,22 @@
           <w:rFonts w:asciiTheme="majorHAnsi" w:hAnsiTheme="majorHAnsi" w:cstheme="majorHAnsi"/>
           <w:szCs w:val="24"/>
         </w:rPr>
-        <w:t>During database discovery, newly emerging RCD forms were encountered, demanding systematic expansion. We executed a multi-layered literature and database surveillance strategy: (a) forward-citation tracking of NCCD 2018 article {Galluzzi, 2018 #782025} to identify post-consensus RCD forms; (b) PubMed systematic searches using the "-ptosis" and "-osis" suffix patterns combined with "cell death" terminology; (c) surveillance of bioRxiv and medRxiv preprints (2024–2026); and (d) cross-referencing against the RCD form inventories of all association databases and resources (Supplementary Table S2).</w:t>
+        <w:t>During database discovery, newly emerging RCD forms were encountered, demanding systematic expansion. We executed a multi-layered literature and database surveillance strategy: (a) forward-citation tracking of NCCD 2018 article {Galluzzi, 2018 #782025} to identify post-consensus RCD forms; (b) PubMed systematic searches using the "-ptosis" and "-osis" suffix patterns combined with "cell death" terminology; (c) surveillance of bioRxiv and medRxiv preprints (2024–2026); and (d) cross-referencing against the RCD form inventories of all association databases and resources (</w:t>
+      </w:r>
+      <w:r>
+        <w:rPr>
+          <w:rFonts w:asciiTheme="majorHAnsi" w:hAnsiTheme="majorHAnsi" w:cstheme="majorHAnsi"/>
+          <w:szCs w:val="24"/>
+          <w:highlight w:val="green"/>
+        </w:rPr>
+        <w:t xml:space="preserve">Supplementary Table S2</w:t>
+      </w:r>
+      <w:r>
+        <w:rPr>
+          <w:rFonts w:asciiTheme="majorHAnsi" w:hAnsiTheme="majorHAnsi" w:cstheme="majorHAnsi"/>
+          <w:szCs w:val="24"/>
+        </w:rPr>
+        <w:t xml:space="preserve">).</w:t>
       </w:r>
     </w:p>
     <w:p>
@@ -1346,8 +1385,82 @@
           <w:rFonts w:asciiTheme="majorHAnsi" w:hAnsiTheme="majorHAnsi" w:cstheme="majorHAnsi"/>
           <w:szCs w:val="24"/>
         </w:rPr>
-        <w:lastRenderedPageBreak/>
-        <w:t>multi-optosis classification (rodr_category) untouched (Supplementary Table S3; Supplementary Table S4). Evidence grades in Supplementary Tables S3 and S6 use the A–D scale: A, well-established (&gt;100 publications); B, established (10–100); C, emerging (2–10); D, proposed (1); N, not yet classified. The adjudication framework and its governance are documented in Supplementary Note S1; the complete evaluation architecture (RCD entity classification, gene-RCD association evidence, and pipeline quality gates) is summarized in Supplementary Figure S1. Discordance between the independent classification layers is adjudicated, on the labels they share, by an independent vote and a human curator verdict that never replaces the original labels; this benchmark and the repair of internal semantic contradictions are documented in Supplementary Note S2.</w:t>
+        <w:t>multi-optosis classification (rodr_category) untouched (</w:t>
+      </w:r>
+      <w:r>
+        <w:rPr>
+          <w:rFonts w:asciiTheme="majorHAnsi" w:hAnsiTheme="majorHAnsi" w:cstheme="majorHAnsi"/>
+          <w:szCs w:val="24"/>
+          <w:highlight w:val="green"/>
+        </w:rPr>
+        <w:t xml:space="preserve">Supplementary Table S3</w:t>
+      </w:r>
+      <w:r>
+        <w:rPr>
+          <w:rFonts w:asciiTheme="majorHAnsi" w:hAnsiTheme="majorHAnsi" w:cstheme="majorHAnsi"/>
+          <w:szCs w:val="24"/>
+        </w:rPr>
+        <w:t xml:space="preserve">; </w:t>
+      </w:r>
+      <w:r>
+        <w:rPr>
+          <w:rFonts w:asciiTheme="majorHAnsi" w:hAnsiTheme="majorHAnsi" w:cstheme="majorHAnsi"/>
+          <w:szCs w:val="24"/>
+          <w:highlight w:val="green"/>
+        </w:rPr>
+        <w:t xml:space="preserve">Supplementary Table S4</w:t>
+      </w:r>
+      <w:r>
+        <w:rPr>
+          <w:rFonts w:asciiTheme="majorHAnsi" w:hAnsiTheme="majorHAnsi" w:cstheme="majorHAnsi"/>
+          <w:szCs w:val="24"/>
+        </w:rPr>
+        <w:t xml:space="preserve">). Evidence grades in Supplementary Tables S3 and S6 use the A–D scale: A, well-established (&gt;100 publications); B, established (10–100); C, emerging (2–10); D, proposed (1); N, not yet classified. The adjudication framework and its governance are documented in </w:t>
+      </w:r>
+      <w:r>
+        <w:rPr>
+          <w:rFonts w:asciiTheme="majorHAnsi" w:hAnsiTheme="majorHAnsi" w:cstheme="majorHAnsi"/>
+          <w:szCs w:val="24"/>
+          <w:highlight w:val="green"/>
+        </w:rPr>
+        <w:t xml:space="preserve">Supplementary Note S1</w:t>
+      </w:r>
+      <w:r>
+        <w:rPr>
+          <w:rFonts w:asciiTheme="majorHAnsi" w:hAnsiTheme="majorHAnsi" w:cstheme="majorHAnsi"/>
+          <w:szCs w:val="24"/>
+        </w:rPr>
+        <w:t xml:space="preserve">; the complete evaluation architecture (RCD entity classification, gene-RCD association evidence, and pipeline quality gates) is summarized in </w:t>
+      </w:r>
+      <w:r>
+        <w:rPr>
+          <w:rFonts w:asciiTheme="majorHAnsi" w:hAnsiTheme="majorHAnsi" w:cstheme="majorHAnsi"/>
+          <w:szCs w:val="24"/>
+          <w:highlight w:val="green"/>
+        </w:rPr>
+        <w:t xml:space="preserve">Supplementary Figure S1</w:t>
+      </w:r>
+      <w:r>
+        <w:rPr>
+          <w:rFonts w:asciiTheme="majorHAnsi" w:hAnsiTheme="majorHAnsi" w:cstheme="majorHAnsi"/>
+          <w:szCs w:val="24"/>
+        </w:rPr>
+        <w:t xml:space="preserve">. Discordance between the independent classification layers is adjudicated, on the labels they share, by an independent vote and a human curator verdict that never replaces the original labels; this benchmark and the repair of internal semantic contradictions are documented in </w:t>
+      </w:r>
+      <w:r>
+        <w:rPr>
+          <w:rFonts w:asciiTheme="majorHAnsi" w:hAnsiTheme="majorHAnsi" w:cstheme="majorHAnsi"/>
+          <w:szCs w:val="24"/>
+          <w:highlight w:val="green"/>
+        </w:rPr>
+        <w:t xml:space="preserve">Supplementary Note S2</w:t>
+      </w:r>
+      <w:r>
+        <w:rPr>
+          <w:rFonts w:asciiTheme="majorHAnsi" w:hAnsiTheme="majorHAnsi" w:cstheme="majorHAnsi"/>
+          <w:szCs w:val="24"/>
+        </w:rPr>
+        <w:t xml:space="preserve">.</w:t>
       </w:r>
     </w:p>
     <w:p>
@@ -3451,7 +3564,22 @@
           <w:rFonts w:asciiTheme="majorHAnsi" w:hAnsiTheme="majorHAnsi" w:cstheme="majorHAnsi"/>
           <w:szCs w:val="24"/>
         </w:rPr>
-        <w:t xml:space="preserve"> (Dataset S1)</w:t>
+        <w:t xml:space="preserve"> (</w:t>
+      </w:r>
+      <w:r>
+        <w:rPr>
+          <w:rFonts w:asciiTheme="majorHAnsi" w:hAnsiTheme="majorHAnsi" w:cstheme="majorHAnsi"/>
+          <w:szCs w:val="24"/>
+          <w:highlight w:val="green"/>
+        </w:rPr>
+        <w:t xml:space="preserve">Dataset S1</w:t>
+      </w:r>
+      <w:r>
+        <w:rPr>
+          <w:rFonts w:asciiTheme="majorHAnsi" w:hAnsiTheme="majorHAnsi" w:cstheme="majorHAnsi"/>
+          <w:szCs w:val="24"/>
+        </w:rPr>
+        <w:t xml:space="preserve">)</w:t>
       </w:r>
       <w:r>
         <w:rPr>
@@ -3508,7 +3636,24 @@
           <w:color w:val="auto"/>
           <w:szCs w:val="24"/>
         </w:rPr>
-        <w:t xml:space="preserve">During manuscript preparation, nine additional cell death-related terms were proposed for inclusion (NECSO, Triaptosis, Mitoxyperilysis, Eryptosis, Cobaltosis, Calcioptosis, Corneoptosis, plus Pyronecrosis and Spectosis already catalogued). Each was evaluated against the same five-criteria framework. Four met the threshold for inclusion in the controlled vocabulary (NECSO, Triaptosis, Mitoxyperilysis, Eryptosis). Three further forms encountered during database discovery (Floatptosis, Lysozincrosis, and Metalloptosis) were also admitted, Floatptosis and Lysozincrosis as a cell-type program (L4) and a subtype (L2), respectively, and Metalloptosis as an umbrella term, completing the 53-entity vocabulary. An external audit subsequently integrated three additional databases (Reactome pathway-specific gene sets, WikiPathways, and XDeathDB), which contributed association records to existing entities rather than new entities (Supplementary Table S3). </w:t>
+        <w:t>During manuscript preparation, nine additional cell death-related terms were proposed for inclusion (NECSO, Triaptosis, Mitoxyperilysis, Eryptosis, Cobaltosis, Calcioptosis, Corneoptosis, plus Pyronecrosis and Spectosis already catalogued). Each was evaluated against the same five-criteria framework. Four met the threshold for inclusion in the controlled vocabulary (NECSO, Triaptosis, Mitoxyperilysis, Eryptosis). Three further forms encountered during database discovery (Floatptosis, Lysozincrosis, and Metalloptosis) were also admitted, Floatptosis and Lysozincrosis as a cell-type program (L4) and a subtype (L2), respectively, and Metalloptosis as an umbrella term, completing the 53-entity vocabulary. An external audit subsequently integrated three additional databases (Reactome pathway-specific gene sets, WikiPathways, and XDeathDB), which contributed association records to existing entities rather than new entities (</w:t>
+      </w:r>
+      <w:r>
+        <w:rPr>
+          <w:rFonts w:asciiTheme="majorHAnsi" w:hAnsiTheme="majorHAnsi" w:cstheme="majorHAnsi"/>
+          <w:color w:val="auto"/>
+          <w:szCs w:val="24"/>
+          <w:highlight w:val="green"/>
+        </w:rPr>
+        <w:t xml:space="preserve">Supplementary Table S3</w:t>
+      </w:r>
+      <w:r>
+        <w:rPr>
+          <w:rFonts w:asciiTheme="majorHAnsi" w:hAnsiTheme="majorHAnsi" w:cstheme="majorHAnsi"/>
+          <w:color w:val="auto"/>
+          <w:szCs w:val="24"/>
+        </w:rPr>
+        <w:t xml:space="preserve">). </w:t>
       </w:r>
     </w:p>
     <w:p>
@@ -3897,7 +4042,52 @@
           <w:rFonts w:asciiTheme="majorHAnsi" w:hAnsiTheme="majorHAnsi" w:cstheme="majorHAnsi"/>
           <w:szCs w:val="24"/>
         </w:rPr>
-        <w:t>The final RCD form vocabulary consolidates 62 original name strings from 20 association databases and resources into 53 RCD-related entities through 9 synonym-merge groups (11 name eliminations, 2 split names). All 53 RCD-related entities carry gene-level evidence in the unified matrix (Supplementary Table S3). The full expansion and normalization methodology is documented in the Materials and Methods (Normalization mapping) and Supplementary Table S3. The newly admitted RCD-related entities are listed in Supplementary Table S6.</w:t>
+        <w:t>The final RCD form vocabulary consolidates 62 original name strings from 20 association databases and resources into 53 RCD-related entities through 9 synonym-merge groups (11 name eliminations, 2 split names). All 53 RCD-related entities carry gene-level evidence in the unified matrix (</w:t>
+      </w:r>
+      <w:r>
+        <w:rPr>
+          <w:rFonts w:asciiTheme="majorHAnsi" w:hAnsiTheme="majorHAnsi" w:cstheme="majorHAnsi"/>
+          <w:szCs w:val="24"/>
+          <w:highlight w:val="green"/>
+        </w:rPr>
+        <w:t xml:space="preserve">Supplementary Table S3</w:t>
+      </w:r>
+      <w:r>
+        <w:rPr>
+          <w:rFonts w:asciiTheme="majorHAnsi" w:hAnsiTheme="majorHAnsi" w:cstheme="majorHAnsi"/>
+          <w:szCs w:val="24"/>
+        </w:rPr>
+        <w:t xml:space="preserve">). The full expansion and normalization methodology is documented in the Materials and Methods (Normalization mapping) and </w:t>
+      </w:r>
+      <w:r>
+        <w:rPr>
+          <w:rFonts w:asciiTheme="majorHAnsi" w:hAnsiTheme="majorHAnsi" w:cstheme="majorHAnsi"/>
+          <w:szCs w:val="24"/>
+          <w:highlight w:val="green"/>
+        </w:rPr>
+        <w:t xml:space="preserve">Supplementary Table S3</w:t>
+      </w:r>
+      <w:r>
+        <w:rPr>
+          <w:rFonts w:asciiTheme="majorHAnsi" w:hAnsiTheme="majorHAnsi" w:cstheme="majorHAnsi"/>
+          <w:szCs w:val="24"/>
+        </w:rPr>
+        <w:t xml:space="preserve">. The newly admitted RCD-related entities are listed in </w:t>
+      </w:r>
+      <w:r>
+        <w:rPr>
+          <w:rFonts w:asciiTheme="majorHAnsi" w:hAnsiTheme="majorHAnsi" w:cstheme="majorHAnsi"/>
+          <w:szCs w:val="24"/>
+          <w:highlight w:val="green"/>
+        </w:rPr>
+        <w:t xml:space="preserve">Supplementary Table S6</w:t>
+      </w:r>
+      <w:r>
+        <w:rPr>
+          <w:rFonts w:asciiTheme="majorHAnsi" w:hAnsiTheme="majorHAnsi" w:cstheme="majorHAnsi"/>
+          <w:szCs w:val="24"/>
+        </w:rPr>
+        <w:t xml:space="preserve">.</w:t>
       </w:r>
     </w:p>
     <w:p>
@@ -6674,8 +6864,22 @@
           <w:rFonts w:asciiTheme="majorHAnsi" w:hAnsiTheme="majorHAnsi" w:cstheme="majorHAnsi"/>
           <w:szCs w:val="24"/>
         </w:rPr>
-        <w:lastRenderedPageBreak/>
-        <w:t>controlled vocabulary of 53 RCD-related entities, consolidated from 62 original name strings across 20 association databases and resources through systematic literature and database surveillance. Supplementary Table S9 compares RCDome against FerrDB v3 and RCDdb across the resources' key features. The complete codebase is available for reproducibility and independent audit of every step from database extraction to evidence verification.</w:t>
+        <w:t xml:space="preserve">controlled vocabulary of 53 RCD-related entities, consolidated from 62 original name strings across 20 association databases and resources through systematic literature and database surveillance. </w:t>
+      </w:r>
+      <w:r>
+        <w:rPr>
+          <w:rFonts w:asciiTheme="majorHAnsi" w:hAnsiTheme="majorHAnsi" w:cstheme="majorHAnsi"/>
+          <w:szCs w:val="24"/>
+          <w:highlight w:val="green"/>
+        </w:rPr>
+        <w:t xml:space="preserve">Supplementary Table S9</w:t>
+      </w:r>
+      <w:r>
+        <w:rPr>
+          <w:rFonts w:asciiTheme="majorHAnsi" w:hAnsiTheme="majorHAnsi" w:cstheme="majorHAnsi"/>
+          <w:szCs w:val="24"/>
+        </w:rPr>
+        <w:t xml:space="preserve"> compares RCDome against FerrDB v3 and RCDdb across the resources' key features. The complete codebase is available for reproducibility and independent audit of every step from database extraction to evidence verification.</w:t>
       </w:r>
     </w:p>
     <w:p>
@@ -7113,32 +7317,56 @@
         <w:t>Supplementary Note S4</w:t>
       </w:r>
       <w:r>
-        <w:t>) spanning five ontological levels; importantly, canonicalization denotes vocabulary normalization and does not confer modality status, and only 19 of the 53 entities satisfy the BG0–BG6 hard-gate criteria for classification as bona fide RCD modalities. The 53 entities are organized into: 19 RCD modalities (bona fide cell death mechanisms with distinct molecular machinery, admitted through the BG0-BG6 hard gates), 7 subtypes (mechanistic subdivisions of parent modalities), 2 triggers (events that initiate cell death without themselves being death mechanisms), 13 functional/contextual categories (contextual programs, morphological outcomes, cell-type and differentiation programs), and 12 generic/umbrella/taxon concepts (umbrella, legacy, taxon-specific, and speculative emerging terms). All 53 entities carry gene-level evidence in the unified matrix (Dataset S1).</w:t>
-      </w:r>
-    </w:p>
-    <w:p>
-      <w:pPr>
-        <w:spacing w:after="0" w:line="240" w:lineRule="auto"/>
-        <w:rPr>
-          <w:rFonts w:asciiTheme="majorHAnsi" w:hAnsiTheme="majorHAnsi" w:cstheme="majorHAnsi"/>
-          <w:szCs w:val="24"/>
-        </w:rPr>
-      </w:pPr>
-    </w:p>
-    <w:p>
-      <w:pPr>
-        <w:spacing w:after="0" w:line="240" w:lineRule="auto"/>
-        <w:rPr>
-          <w:rFonts w:asciiTheme="majorHAnsi" w:hAnsiTheme="majorHAnsi" w:cstheme="majorHAnsi"/>
-          <w:szCs w:val="24"/>
-        </w:rPr>
-      </w:pPr>
-      <w:r>
-        <w:rPr>
-          <w:rFonts w:asciiTheme="majorHAnsi" w:hAnsiTheme="majorHAnsi" w:cstheme="majorHAnsi"/>
-          <w:szCs w:val="24"/>
-        </w:rPr>
-        <w:t xml:space="preserve">The compendium contains 22,473 gene-RCD association rows spanning 9,265 unique HGNC-validated human gene symbols and 53 RCD-related entities (62 original RCD form name strings, consolidated through 9 synonym-merge groups (11 name eliminations, 2 split names)) (Dataset S1). Because the matrix preserves every source-database claim, the 22,473 rows correspond to 21,568 unique gene-RCD associations plus 905 rows of genuine multi-database corroboration, retained as separate rows rather than consolidated because each source may legitimately assign a different mechanistic classification to the same gene-RCD association (e.g., Phase 2A/D versus Phase 2D verdicts); consolidating them into a single row would overwrite the source-specific classifications. Byte-identical duplicate rows arising from a single-source extraction artifact (3,874 XDeathDB key-gene entries) were removed as carrying no additional information, with one copy of each unique record retained for full traceability. Ten further rows for Calcioptosis, a form formally excluded by the five-criteria admission framework (see Materials and Methods), were removed, eliminating three genes (APMAP, ATP11C, CDC50A) that appeared only under that form. Gene biotypes are predominantly protein-coding (20,642, 91.9%), with non-coding RNA genes contributing 1,831 non-coding entries: 1,177 miRNAs (5.2%), 509 long non-coding RNAs (2.3%), 81 pseudogenes (0.4%), and 64 other non-coding RNAs (0.3%); the 1,836 rows that previously lacked a gene biotype (1,832 MSigDB-only plus 4 Elicit-only) were resolved via HGNC mapping, leaving no empty gene biotype. </w:t>
+        <w:t>) spanning five ontological levels; importantly, canonicalization denotes vocabulary normalization and does not confer modality status, and only 19 of the 53 entities satisfy the BG0–BG6 hard-gate criteria for classification as bona fide RCD modalities. The 53 entities are organized into: 19 RCD modalities (bona fide cell death mechanisms with distinct molecular machinery, admitted through the BG0-BG6 hard gates), 7 subtypes (mechanistic subdivisions of parent modalities), 2 triggers (events that initiate cell death without themselves being death mechanisms), 13 functional/contextual categories (contextual programs, morphological outcomes, cell-type and differentiation programs), and 12 generic/umbrella/taxon concepts (umbrella, legacy, taxon-specific, and speculative emerging terms). All 53 entities carry gene-level evidence in the unified matrix (</w:t>
+      </w:r>
+      <w:r>
+        <w:rPr>
+          <w:highlight w:val="green"/>
+        </w:rPr>
+        <w:t xml:space="preserve">Dataset S1</w:t>
+      </w:r>
+      <w:r>
+        <w:t xml:space="preserve">).</w:t>
+      </w:r>
+    </w:p>
+    <w:p>
+      <w:pPr>
+        <w:spacing w:after="0" w:line="240" w:lineRule="auto"/>
+        <w:rPr>
+          <w:rFonts w:asciiTheme="majorHAnsi" w:hAnsiTheme="majorHAnsi" w:cstheme="majorHAnsi"/>
+          <w:szCs w:val="24"/>
+        </w:rPr>
+      </w:pPr>
+    </w:p>
+    <w:p>
+      <w:pPr>
+        <w:spacing w:after="0" w:line="240" w:lineRule="auto"/>
+        <w:rPr>
+          <w:rFonts w:asciiTheme="majorHAnsi" w:hAnsiTheme="majorHAnsi" w:cstheme="majorHAnsi"/>
+          <w:szCs w:val="24"/>
+        </w:rPr>
+      </w:pPr>
+      <w:r>
+        <w:rPr>
+          <w:rFonts w:asciiTheme="majorHAnsi" w:hAnsiTheme="majorHAnsi" w:cstheme="majorHAnsi"/>
+          <w:szCs w:val="24"/>
+        </w:rPr>
+        <w:t>The compendium contains 22,473 gene-RCD association rows spanning 9,265 unique HGNC-validated human gene symbols and 53 RCD-related entities (62 original RCD form name strings, consolidated through 9 synonym-merge groups (11 name eliminations, 2 split names)) (</w:t>
+      </w:r>
+      <w:r>
+        <w:rPr>
+          <w:rFonts w:asciiTheme="majorHAnsi" w:hAnsiTheme="majorHAnsi" w:cstheme="majorHAnsi"/>
+          <w:szCs w:val="24"/>
+          <w:highlight w:val="green"/>
+        </w:rPr>
+        <w:t xml:space="preserve">Dataset S1</w:t>
+      </w:r>
+      <w:r>
+        <w:rPr>
+          <w:rFonts w:asciiTheme="majorHAnsi" w:hAnsiTheme="majorHAnsi" w:cstheme="majorHAnsi"/>
+          <w:szCs w:val="24"/>
+        </w:rPr>
+        <w:t xml:space="preserve">). Because the matrix preserves every source-database claim, the 22,473 rows correspond to 21,568 unique gene-RCD associations plus 905 rows of genuine multi-database corroboration, retained as separate rows rather than consolidated because each source may legitimately assign a different mechanistic classification to the same gene-RCD association (e.g., Phase 2A/D versus Phase 2D verdicts); consolidating them into a single row would overwrite the source-specific classifications. Byte-identical duplicate rows arising from a single-source extraction artifact (3,874 XDeathDB key-gene entries) were removed as carrying no additional information, with one copy of each unique record retained for full traceability. Ten further rows for Calcioptosis, a form formally excluded by the five-criteria admission framework (see Materials and Methods), were removed, eliminating three genes (APMAP, ATP11C, CDC50A) that appeared only under that form. Gene biotypes are predominantly protein-coding (20,642, 91.9%), with non-coding RNA genes contributing 1,831 non-coding entries: 1,177 miRNAs (5.2%), 509 long non-coding RNAs (2.3%), 81 pseudogenes (0.4%), and 64 other non-coding RNAs (0.3%); the 1,836 rows that previously lacked a gene biotype (1,832 MSigDB-only plus 4 Elicit-only) were resolved via HGNC mapping, leaving no empty gene biotype. </w:t>
       </w:r>
     </w:p>
     <w:p>
@@ -7227,7 +7455,22 @@
           <w:rFonts w:asciiTheme="majorHAnsi" w:hAnsiTheme="majorHAnsi" w:cstheme="majorHAnsi"/>
           <w:szCs w:val="24"/>
         </w:rPr>
-        <w:t>Read at the level of mechanism, the compendium reveals a remarkably small execution core: only 367 gene-RCD pairs (4.2% of the role-resolved set) are executors, genes that directly pore, cleave, or permeabilize to kill the cell, while 8,369 pairs (94.8%) are regulators that promote or inhibit death without executing it (Figure 3A). Within the compiled RCDome association universe and under the evidence-first adjudication, the mechanistically involved set is dominated by regulatory associations surrounding a comparatively small executor subset.</w:t>
+        <w:t>Read at the level of mechanism, the compendium reveals a remarkably small execution core: only 367 gene-RCD pairs (4.2% of the role-resolved set) are executors, genes that directly pore, cleave, or permeabilize to kill the cell, while 8,369 pairs (94.8%) are regulators that promote or inhibit death without executing it (</w:t>
+      </w:r>
+      <w:r>
+        <w:rPr>
+          <w:rFonts w:asciiTheme="majorHAnsi" w:hAnsiTheme="majorHAnsi" w:cstheme="majorHAnsi"/>
+          <w:szCs w:val="24"/>
+          <w:highlight w:val="green"/>
+        </w:rPr>
+        <w:t xml:space="preserve">Figure 3A</w:t>
+      </w:r>
+      <w:r>
+        <w:rPr>
+          <w:rFonts w:asciiTheme="majorHAnsi" w:hAnsiTheme="majorHAnsi" w:cstheme="majorHAnsi"/>
+          <w:szCs w:val="24"/>
+        </w:rPr>
+        <w:t xml:space="preserve">). Within the compiled RCDome association universe and under the evidence-first adjudication, the mechanistically involved set is dominated by regulatory associations surrounding a comparatively small executor subset.</w:t>
       </w:r>
     </w:p>
     <w:p>
@@ -7325,7 +7568,7 @@
           <w:rFonts w:asciiTheme="majorHAnsi" w:hAnsiTheme="majorHAnsi" w:cstheme="majorHAnsi"/>
           <w:szCs w:val="24"/>
         </w:rPr>
-        <w:t xml:space="preserve">, of which five (cuproptosis, disulfidptosis, erebosis, alkaliptosis, and oxeiptosis) were not described by the NCCD and had been AI-extracted from a 6,603-PDF corpus and human-validated, and 20 were drafted de novo by the RCDome (19 founding-draft plus one pre-PubMed term) and substantiated by their founding articles. One additional record ("Senescence and Autophagy in Cancer") was a composite WikiPathways pathway label and was retained, per the provenance policy, with the evidence PMIDs of its two parent entities rather than a fabricated PMID of its own. Thirteen entities carried both an NCCD and a Rodrigues </w:t>
+        <w:t>, of which five (cuproptosis, disulfidptosis, erebosis, alkaliptosis, and oxeiptosis) were not described by the NCCD and had been AI-extracted from a 6,603-PDF corpus and human-validated, and 20 were drafted de novo by the RCDome (19 founding-draft plus one pre-PubMed term) and substantiated by their founding articles. One additional record ("Senescence and Autophagy in Cancer") was a composite WikiPathways pathway label and was retained, per the provenance policy, with the evidence PMIDs of its two parent entities rather than a fabricated PMID of its own. Thirteen entities carried both an NCCD and a Rodrigues et al., 2025</w:t>
       </w:r>
       <w:r>
         <w:rPr>
@@ -7353,7 +7596,7 @@
           <w:rFonts w:asciiTheme="majorHAnsi" w:hAnsiTheme="majorHAnsi" w:cstheme="majorHAnsi"/>
           <w:szCs w:val="24"/>
         </w:rPr>
-        <w:t xml:space="preserve"> represented in the matrix as finer-grained entities that Rodrigues </w:t>
+        <w:t xml:space="preserve"> represented in the matrix as finer-grained entities that Rodrigues et al., 2025</w:t>
       </w:r>
       <w:r>
         <w:rPr>
@@ -7532,7 +7775,24 @@
           <w:color w:val="000000" w:themeColor="text1"/>
           <w:szCs w:val="24"/>
         </w:rPr>
-        <w:t>Two ontology corrections were applied following the biological curation: MPT-driven necrosis was reclassified from the trigger level (L3) to the modality level (L1), while the mitochondrial permeability transition (MPT) itself remains a trigger (L3), correcting a trigger-centered placement; and vacuolar cell death was reclassified from L4 to L5 as a taxon-specific morphological category (plant + protist; not human). Following the adoption of strict hard gates (BG0-BG6; Materials and Methods), the ontological levels were recalibrated across the 53 entities: L1 was restricted to the 19 bona fide modalities, while morphology, umbrella, contextual, taxon-specific, legacy, and speculative emerging forms were re-leveled to L2-L5 (Supplementary Table S11).</w:t>
+        <w:t>Two ontology corrections were applied following the biological curation: MPT-driven necrosis was reclassified from the trigger level (L3) to the modality level (L1), while the mitochondrial permeability transition (MPT) itself remains a trigger (L3), correcting a trigger-centered placement; and vacuolar cell death was reclassified from L4 to L5 as a taxon-specific morphological category (plant + protist; not human). Following the adoption of strict hard gates (BG0-BG6; Materials and Methods), the ontological levels were recalibrated across the 53 entities: L1 was restricted to the 19 bona fide modalities, while morphology, umbrella, contextual, taxon-specific, legacy, and speculative emerging forms were re-leveled to L2-L5 (</w:t>
+      </w:r>
+      <w:r>
+        <w:rPr>
+          <w:rFonts w:asciiTheme="majorHAnsi" w:hAnsiTheme="majorHAnsi" w:cstheme="majorHAnsi"/>
+          <w:color w:val="000000" w:themeColor="text1"/>
+          <w:szCs w:val="24"/>
+          <w:highlight w:val="green"/>
+        </w:rPr>
+        <w:t xml:space="preserve">Supplementary Table S11</w:t>
+      </w:r>
+      <w:r>
+        <w:rPr>
+          <w:rFonts w:asciiTheme="majorHAnsi" w:hAnsiTheme="majorHAnsi" w:cstheme="majorHAnsi"/>
+          <w:color w:val="000000" w:themeColor="text1"/>
+          <w:szCs w:val="24"/>
+        </w:rPr>
+        <w:t xml:space="preserve">).</w:t>
       </w:r>
     </w:p>
     <w:p>
@@ -8818,7 +9078,37 @@
           <w:rFonts w:asciiTheme="majorHAnsi" w:hAnsiTheme="majorHAnsi" w:cstheme="majorHAnsi"/>
           <w:szCs w:val="24"/>
         </w:rPr>
-        <w:t>The evidence-first adjudication resolved 4,881 (22.6%) of the 21,568 unique gene-RCD pairs as mechanistically involved (YES) and 15,589 (72.3%) as not mechanistically involved (NO). Among the role-resolved pairs, 367 (4.2%) were executors, genes that directly execute the death pathway, and 8,369 (94.8%) were regulators that promote or inhibit it. Across the 21,568 unique gene-RCD pairs, roles resolved as 8,369 regulators, 367 executors, 94 markers, and 11,800 with an unresolved role; direction (across all role-resolved associations) resolved as PROMOTES for 4,179, PROTECTS for 4,181, and UNCLEAR for 12,270, a near-even pro-death versus anti-death balance. Overall, 5,826 of the 9,265 genes represented in RCDome (62.9%) had at least one mechanistically involved association. Classification yield varied markedly by source database: the fraction of associations classified as mechanistically involved ranged from 5.6% (XDeathDB) to 56.3% (WikiPathways) (Supplementary Figure S3).</w:t>
+        <w:t>The evidence-first adjudication resolved 4,881 (22.6%) of the 21,568 unique gene-RCD pairs as mechanistically involved (YES) and 15,589 (72.3%) as not mechanistically involved (NO). Among the role-resolved pairs, 367 (4.2%) were executors, genes that directly execute the death pathway, and 8,369 (94.8%) were regulators that promote or inhibit it. Across the 21,568 unique gene-RCD pairs, roles resolved as 8,369 regulators, 367 executors, 94 markers, and 11,800 with an unresolved role; direction (across all role-resolved associations) resolved as PROMOTES for 4,179, PROTECTS for 4,181, and UNCLEAR for 12,270, a near-even pro-death versus anti-death balance (</w:t>
+      </w:r>
+      <w:r>
+        <w:rPr>
+          <w:rFonts w:asciiTheme="majorHAnsi" w:hAnsiTheme="majorHAnsi" w:cstheme="majorHAnsi"/>
+          <w:szCs w:val="24"/>
+          <w:highlight w:val="green"/>
+        </w:rPr>
+        <w:t xml:space="preserve">Figure 3C</w:t>
+      </w:r>
+      <w:r>
+        <w:rPr>
+          <w:rFonts w:asciiTheme="majorHAnsi" w:hAnsiTheme="majorHAnsi" w:cstheme="majorHAnsi"/>
+          <w:szCs w:val="24"/>
+        </w:rPr>
+        <w:t xml:space="preserve">). Overall, 5,826 of the 9,265 genes represented in RCDome (62.9%) had at least one mechanistically involved association. Classification yield varied markedly by source database: the fraction of associations classified as mechanistically involved ranged from 5.6% (XDeathDB) to 56.3% (WikiPathways) (</w:t>
+      </w:r>
+      <w:r>
+        <w:rPr>
+          <w:rFonts w:asciiTheme="majorHAnsi" w:hAnsiTheme="majorHAnsi" w:cstheme="majorHAnsi"/>
+          <w:szCs w:val="24"/>
+          <w:highlight w:val="green"/>
+        </w:rPr>
+        <w:t xml:space="preserve">Supplementary Figure S3</w:t>
+      </w:r>
+      <w:r>
+        <w:rPr>
+          <w:rFonts w:asciiTheme="majorHAnsi" w:hAnsiTheme="majorHAnsi" w:cstheme="majorHAnsi"/>
+          <w:szCs w:val="24"/>
+        </w:rPr>
+        <w:t xml:space="preserve">).</w:t>
       </w:r>
     </w:p>
     <w:p>
@@ -9035,7 +9325,16 @@
         </w:r>
       </w:hyperlink>
       <w:r>
-        <w:t xml:space="preserve">. The Gene Catalog module exposes the complete 22,473-row × 100-column matrix (Dataset S1) as a filterable, sortable table with ten columns, gene, biotype, RCD entity, cancer gene, confidence tier, mechanistic, role, direction, source databases, and evidence, and a Direction/Role source selector that switches the displayed annotation among the DeepSeek chain-of-thought, Elicit, Consensus, GPT-4o, and evidence-first adjudication sources. Each analysis is preserved in its own columns, so the interface never conflates provenance. A Death core preset filters to the 367 executor pairs; a per-entity comparison table presents Elicit versus DeepSeek executor and </w:t>
+        <w:t>. The Gene Catalog module exposes the complete 22,473-row × 100-column matrix (Dataset S1) as a filterable, sortable table wi</w:t>
+      </w:r>
+      <w:r>
+        <w:rPr>
+          <w:highlight w:val="green"/>
+        </w:rPr>
+        <w:t xml:space="preserve">th ten col</w:t>
+      </w:r>
+      <w:r>
+        <w:t xml:space="preserve">umns, gene, biotype, RCD entity, cancer gene, confidence tier, mechanistic, role, direction, source databases, and evidence, and a Direction/Role source selector that switches the displayed annotation among the DeepSeek chain-of-thought, Elicit, Consensus, GPT-4o, and evidence-first adjudication sources. Each analysis is preserved in its own columns, so the interface never conflates provenance. A Death core preset filters to the 367 executor pairs; a per-entity comparison table presents Elicit versus DeepSeek executor and </w:t>
       </w:r>
       <w:r>
         <w:lastRenderedPageBreak/>
@@ -9232,8 +9531,22 @@
           <w:rFonts w:asciiTheme="majorHAnsi" w:hAnsiTheme="majorHAnsi" w:cstheme="majorHAnsi"/>
           <w:szCs w:val="24"/>
         </w:rPr>
-        <w:lastRenderedPageBreak/>
-        <w:t>The application was built iteratively with AI assistance (DeepSeek and Consensus classification, AI-generated pathway figures and descriptions) under the governance rules described in the Materials and Methods section. Every value exposed in the interface was verified against the compendium matrix (Knock Test), and every AI-generated element is traceable to its source. Detailed AI usage, token, runtime, and cost figures for every AI-assisted phase are reported in Supplementary Note S6 (AI usage, tokens, and cost).</w:t>
+        <w:t xml:space="preserve">The application was built iteratively with AI assistance (DeepSeek and Consensus classification, AI-generated pathway figures and descriptions) under the governance rules described in the Materials and Methods section. Every value exposed in the interface was verified against the compendium matrix (Knock Test), and every AI-generated element is traceable to its source. Detailed AI usage, token, runtime, and cost figures for every AI-assisted phase are reported in </w:t>
+      </w:r>
+      <w:r>
+        <w:rPr>
+          <w:rFonts w:asciiTheme="majorHAnsi" w:hAnsiTheme="majorHAnsi" w:cstheme="majorHAnsi"/>
+          <w:szCs w:val="24"/>
+          <w:highlight w:val="green"/>
+        </w:rPr>
+        <w:t xml:space="preserve">Supplementary Note S6</w:t>
+      </w:r>
+      <w:r>
+        <w:rPr>
+          <w:rFonts w:asciiTheme="majorHAnsi" w:hAnsiTheme="majorHAnsi" w:cstheme="majorHAnsi"/>
+          <w:szCs w:val="24"/>
+        </w:rPr>
+        <w:t xml:space="preserve"> (AI usage, tokens, and cost).</w:t>
       </w:r>
     </w:p>
     <w:p>
@@ -9629,7 +9942,60 @@
           <w:rFonts w:asciiTheme="majorHAnsi" w:hAnsiTheme="majorHAnsi" w:cstheme="majorHAnsi"/>
           <w:szCs w:val="24"/>
         </w:rPr>
-        <w:t>The direction of regulation is nearly balanced, 4,179 promoters (938 pairs pending delta round) versus 4,181 protectors (across all role-resolved associations), consistent with death as a decision that cells weigh in both directions, not a one-way cascade. And 62.9% of the 9,265 genes have at least one mechanistically-involved association, confirming that RCD is woven through a large fraction of the human genome. Taken together, these numbers change how the field should be read: the core of regulated cell death is small, and most of the compiled network is regulation of death, not execution of it (Figure 3D). Gene coverage is highly heterogeneous across the 53 entities, from Apoptosis (5,897 unique genes) and Autophagy (4,634 unique genes) to Pyronecrosis (1 gene) (Figure 4). Where a subtype carries more genes than its parent, Autosis (1,105 genes) against Autophagy-dependent cell death (110), the difference reflects the depth of database indexing, not ontological inheritance; parent–child gene inventories are not expected to be nested subsets.</w:t>
+        <w:t>The direction of regulation is nearly balanced, 4,179 promoters (938 pairs pending delta round) versus 4,181 protectors (across all role-resolved associations), consistent with death as a decision that cells weigh in both directions, not a one-way cascade (</w:t>
+      </w:r>
+      <w:r>
+        <w:rPr>
+          <w:rFonts w:asciiTheme="majorHAnsi" w:hAnsiTheme="majorHAnsi" w:cstheme="majorHAnsi"/>
+          <w:szCs w:val="24"/>
+          <w:highlight w:val="green"/>
+        </w:rPr>
+        <w:t>Figure 3C</w:t>
+      </w:r>
+      <w:r>
+        <w:rPr>
+          <w:rFonts w:asciiTheme="majorHAnsi" w:hAnsiTheme="majorHAnsi" w:cstheme="majorHAnsi"/>
+          <w:szCs w:val="24"/>
+          <w:highlight w:val="green"/>
+        </w:rPr>
+        <w:t xml:space="preserve">).</w:t>
+      </w:r>
+      <w:r>
+        <w:rPr>
+          <w:rFonts w:asciiTheme="majorHAnsi" w:hAnsiTheme="majorHAnsi" w:cstheme="majorHAnsi"/>
+          <w:szCs w:val="24"/>
+        </w:rPr>
+        <w:t xml:space="preserve"> And 62.9% of the 9,265 genes have at least one mechanistically-involved association, confirming that RCD is woven through a large fraction of the human genome. Taken together, these numbers change how the field should be read: the core of regulated cell death is small, and most of the compiled network is regulation of death, not execution of it (</w:t>
+      </w:r>
+      <w:r>
+        <w:rPr>
+          <w:rFonts w:asciiTheme="majorHAnsi" w:hAnsiTheme="majorHAnsi" w:cstheme="majorHAnsi"/>
+          <w:szCs w:val="24"/>
+          <w:highlight w:val="green"/>
+        </w:rPr>
+        <w:t xml:space="preserve">Figure 3D</w:t>
+      </w:r>
+      <w:r>
+        <w:rPr>
+          <w:rFonts w:asciiTheme="majorHAnsi" w:hAnsiTheme="majorHAnsi" w:cstheme="majorHAnsi"/>
+          <w:szCs w:val="24"/>
+        </w:rPr>
+        <w:t xml:space="preserve">). Gene coverage is highly heterogeneous across the 53 entities, from Apoptosis (5,897 unique genes) and Autophagy (4,634 unique genes) to Pyronecrosis (1 gene) (</w:t>
+      </w:r>
+      <w:r>
+        <w:rPr>
+          <w:rFonts w:asciiTheme="majorHAnsi" w:hAnsiTheme="majorHAnsi" w:cstheme="majorHAnsi"/>
+          <w:szCs w:val="24"/>
+          <w:highlight w:val="green"/>
+        </w:rPr>
+        <w:t xml:space="preserve">Figure 4</w:t>
+      </w:r>
+      <w:r>
+        <w:rPr>
+          <w:rFonts w:asciiTheme="majorHAnsi" w:hAnsiTheme="majorHAnsi" w:cstheme="majorHAnsi"/>
+          <w:szCs w:val="24"/>
+        </w:rPr>
+        <w:t xml:space="preserve">). Where a subtype carries more genes than its parent, Autosis (1,105 genes) against Autophagy-dependent cell death (110), the difference reflects the depth of database indexing, not ontological inheritance; parent–child gene inventories are not expected to be nested subsets.</w:t>
       </w:r>
     </w:p>
     <w:p>
@@ -9878,7 +10244,16 @@
         </w:rPr>
       </w:pPr>
       <w:r>
-        <w:t>Four limitations are explicitly acknowledged. First, twenty-eight of the 53 RCD-related entities were not covered by the previous multi-optosis operational-definition set and therefore required RCDome-specific definition work; in the current decoder, all 53 entities have an operational definition anchored to a reference PMID. Second, the automated classifications rely on LLM calls whose residual error rate cannot be guaranteed across all 21,568 pairs; we repaired 84 self-inconsistent rows and retained 231 as explicitly uncertain, but some fraction of the remaining automated verdicts will be wrong and is open to community correction. Third, 286 DATABASE_ONLY pairs (1.3%) lack any verifiable paper trail in the indexed literature, and 86.3% of validated rows are not mechanistically confirmed, limits of the published record itself rather than of the platform. Fourth, the controlled vocabulary is a governed snapshot of the published record at the matrix freeze date (Dataset S1 freeze date: submission date; ): forms named after the freeze (e.g., ruptosis, 2026) or described only in non-human systems are documented as explicit exclusions in the Materials and Methods rather than silently omitted from the 53-entity vocabulary.</w:t>
+        <w:t>Four limitations are explicitly acknowledged. First, twenty-eight of the 53 RCD-related entities were not covered by the previous multi-optosis operational-definition set and therefore required RCDome-specific definition work; in the current decoder, all 53 entities have an operational definition anchored to a reference PMID. Second, the automated classifications rely on LLM calls whose residual error rate cannot be guaranteed across all 21,568 pairs; we repaired 84 self-inconsistent rows and retained 231 as explicitly uncertain, but some fraction of the remaining automated verdicts will be wrong and is open to community correction. Third, 286 DATABASE_ONLY pairs (1.3%) lack any verifiable paper trail in the indexed literature, and 86.3% of validated rows are not mechanistically confirmed, limits of the published record itself rather than of the platform. Fourth, the controlled vocabulary is a governed snapshot of the published record at the matrix freeze date (</w:t>
+      </w:r>
+      <w:r>
+        <w:rPr>
+          <w:highlight w:val="green"/>
+        </w:rPr>
+        <w:t xml:space="preserve">Dataset S1</w:t>
+      </w:r>
+      <w:r>
+        <w:t xml:space="preserve"> freeze date: submission date; ): forms named after the freeze (e.g., ruptosis, 2026) or described only in non-human systems are documented as explicit exclusions in the Materials and Methods rather than silently omitted from the 53-entity vocabulary.</w:t>
       </w:r>
     </w:p>
     <w:p>
@@ -10010,11 +10385,37 @@
         <w:spacing w:after="0" w:line="240" w:lineRule="auto"/>
       </w:pPr>
       <w:r>
-        <w:t xml:space="preserve">The RCDome compendium matrix (Dataset S1; 22,473 rows × 100 columns; freeze date: submission date), extraction pipeline, and the RCDome web application source code are </w:t>
-      </w:r>
-      <w:r>
-        <w:lastRenderedPageBreak/>
-        <w:t>available at https://github.com/BioCancerInformatics/RCDome. The 20 association databases and resources are publicly accessible at the URLs listed in Supplementary Table S2. All extraction scripts, integration code, and the RCDome Shiny web application source code are available at https://github.com/BioCancerInformatics/RCDome. The complete extraction pipeline is orchestrated by master_extract.py, which executes all 21 channel_*.py extraction scripts in sequence (21 of the 43 scripts in the full pipeline catalog, Supplementary Table S10), producing timestamped, traceability-compliant CSV outputs. The repository also includes automated smoke tests with continuous integration that verify the mechanistic classification mapping, the chain-of-thought governance rules, and the benchmark scoring.https://github.com/BioCancerInformatics/RCDomehttps://github.com/BioCancerInformatics/RCDomehttps://github.com/BioCancerInformatics/RCDomehttps://github.com/BioCancerInformatics/RCDome</w:t>
+        <w:t>The RCDome compendium matrix (</w:t>
+      </w:r>
+      <w:r>
+        <w:rPr>
+          <w:highlight w:val="green"/>
+        </w:rPr>
+        <w:t xml:space="preserve">Dataset S1</w:t>
+      </w:r>
+      <w:r>
+        <w:t xml:space="preserve">; 22,473 rows × 100 columns; freeze date: submission date), extraction pipeline, and the RCDome web application source code are </w:t>
+      </w:r>
+      <w:r>
+        <w:t xml:space="preserve">available at https://github.com/BioCancerInformatics/RCDome. The 20 association databases and resources are publicly accessible at the URLs listed in </w:t>
+      </w:r>
+      <w:r>
+        <w:rPr>
+          <w:highlight w:val="green"/>
+        </w:rPr>
+        <w:t xml:space="preserve">Supplementary Table S2</w:t>
+      </w:r>
+      <w:r>
+        <w:t xml:space="preserve">. All extraction scripts, integration code, and the RCDome Shiny web application source code are available at https://github.com/BioCancerInformatics/RCDome. The complete extraction pipeline is orchestrated by master_extract.py, which executes all 21 channel_*.py extraction scripts in sequence (21 of the 43 scripts in the full pipeline catalog, </w:t>
+      </w:r>
+      <w:r>
+        <w:rPr>
+          <w:highlight w:val="green"/>
+        </w:rPr>
+        <w:t xml:space="preserve">Supplementary Table S10</w:t>
+      </w:r>
+      <w:r>
+        <w:t xml:space="preserve">), producing timestamped, traceability-compliant CSV outputs. The repository also includes automated smoke tests with continuous integration that verify the mechanistic classification mapping, the chain-of-thought governance rules, and the benchmark scoring.https://github.com/BioCancerInformatics/RCDomehttps://github.com/BioCancerInformatics/RCDomehttps://github.com/BioCancerInformatics/RCDomehttps://github.com/BioCancerInformatics/RCDome</w:t>
       </w:r>
       <w:hyperlink r:id="rId43" w:history="1">
         <w:r>
@@ -10557,14 +10958,61 @@
         <w:rPr>
           <w:highlight w:val="green"/>
         </w:rPr>
-        <w:t>(Supplementary Note S8)</w:t>
+        <w:t>(</w:t>
+      </w:r>
+      <w:r>
+        <w:rPr>
+          <w:highlight w:val="green"/>
+        </w:rPr>
+        <w:t xml:space="preserve">Supplementary Note S8</w:t>
+      </w:r>
+      <w:r>
+        <w:rPr>
+          <w:highlight w:val="green"/>
+        </w:rPr>
+        <w:t xml:space="preserve">)</w:t>
       </w:r>
       <w:r>
         <w:t xml:space="preserve">. The cartoon representations, videos, and logos of the RCD entities were generated </w:t>
       </w:r>
       <w:r>
-        <w:lastRenderedPageBreak/>
-        <w:t>from these descriptions under the figure-generation (Supplementary Prompt S3), figure-legend generation (Supplementary Prompt S5), logo creation (Supplementary Prompt S6), and scientific-accuracy audit (Supplementary Prompt S4) frameworks.</w:t>
+        <w:t>from these descriptions under the figure-generation (</w:t>
+      </w:r>
+      <w:r>
+        <w:rPr>
+          <w:highlight w:val="green"/>
+        </w:rPr>
+        <w:t xml:space="preserve">Supplementary Prompt S3</w:t>
+      </w:r>
+      <w:r>
+        <w:t xml:space="preserve">), figure-legend generation (</w:t>
+      </w:r>
+      <w:r>
+        <w:rPr>
+          <w:highlight w:val="green"/>
+        </w:rPr>
+        <w:t xml:space="preserve">Supplementary Prompt S5</w:t>
+      </w:r>
+      <w:r>
+        <w:t xml:space="preserve">), logo creation (</w:t>
+      </w:r>
+      <w:r>
+        <w:rPr>
+          <w:highlight w:val="green"/>
+        </w:rPr>
+        <w:t xml:space="preserve">Supplementary Prompt S6</w:t>
+      </w:r>
+      <w:r>
+        <w:t xml:space="preserve">), and scientific-accuracy audit (</w:t>
+      </w:r>
+      <w:r>
+        <w:rPr>
+          <w:highlight w:val="green"/>
+        </w:rPr>
+        <w:t xml:space="preserve">Supplementary Prompt S4</w:t>
+      </w:r>
+      <w:r>
+        <w:t xml:space="preserve">) frameworks.</w:t>
       </w:r>
     </w:p>
     <w:p>
@@ -10863,8 +11311,17 @@
           <w:rFonts w:asciiTheme="majorHAnsi" w:hAnsiTheme="majorHAnsi" w:cstheme="majorHAnsi"/>
           <w:b/>
           <w:szCs w:val="24"/>
-        </w:rPr>
-        <w:t>Figure 1. RCDome compilation and validation pipeline</w:t>
+          <w:highlight w:val="green"/>
+        </w:rPr>
+        <w:t>Figure 1</w:t>
+      </w:r>
+      <w:r>
+        <w:rPr>
+          <w:rFonts w:asciiTheme="majorHAnsi" w:hAnsiTheme="majorHAnsi" w:cstheme="majorHAnsi"/>
+          <w:b/>
+          <w:szCs w:val="24"/>
+        </w:rPr>
+        <w:t xml:space="preserve">. RCDome compilation and validation pipeline</w:t>
       </w:r>
       <w:r>
         <w:rPr>
@@ -10897,8 +11354,17 @@
           <w:rFonts w:asciiTheme="majorHAnsi" w:hAnsiTheme="majorHAnsi" w:cstheme="majorHAnsi"/>
           <w:b/>
           <w:szCs w:val="24"/>
-        </w:rPr>
-        <w:t>Figure 2. Benchmark evaluation of the three independent analyses.</w:t>
+          <w:highlight w:val="green"/>
+        </w:rPr>
+        <w:t>Figure 2</w:t>
+      </w:r>
+      <w:r>
+        <w:rPr>
+          <w:rFonts w:asciiTheme="majorHAnsi" w:hAnsiTheme="majorHAnsi" w:cstheme="majorHAnsi"/>
+          <w:b/>
+          <w:szCs w:val="24"/>
+        </w:rPr>
+        <w:t xml:space="preserve">. Benchmark evaluation of the three independent analyses.</w:t>
       </w:r>
       <w:r>
         <w:rPr>
@@ -10942,8 +11408,17 @@
           <w:rFonts w:asciiTheme="majorHAnsi" w:hAnsiTheme="majorHAnsi" w:cstheme="majorHAnsi"/>
           <w:b/>
           <w:szCs w:val="24"/>
-        </w:rPr>
-        <w:t>Figure 3. The death core and its regulatory network.</w:t>
+          <w:highlight w:val="green"/>
+        </w:rPr>
+        <w:t>Figure 3</w:t>
+      </w:r>
+      <w:r>
+        <w:rPr>
+          <w:rFonts w:asciiTheme="majorHAnsi" w:hAnsiTheme="majorHAnsi" w:cstheme="majorHAnsi"/>
+          <w:b/>
+          <w:szCs w:val="24"/>
+        </w:rPr>
+        <w:t xml:space="preserve">. The death core and its regulatory network.</w:t>
       </w:r>
       <w:r>
         <w:rPr>
@@ -10976,8 +11451,17 @@
           <w:rFonts w:asciiTheme="majorHAnsi" w:hAnsiTheme="majorHAnsi" w:cstheme="majorHAnsi"/>
           <w:b/>
           <w:szCs w:val="24"/>
-        </w:rPr>
-        <w:t>Figure 4. Gene</w:t>
+          <w:highlight w:val="green"/>
+        </w:rPr>
+        <w:t>Figure 4</w:t>
+      </w:r>
+      <w:r>
+        <w:rPr>
+          <w:rFonts w:asciiTheme="majorHAnsi" w:hAnsiTheme="majorHAnsi" w:cstheme="majorHAnsi"/>
+          <w:b/>
+          <w:szCs w:val="24"/>
+        </w:rPr>
+        <w:t xml:space="preserve">. Gene</w:t>
       </w:r>
       <w:r>
         <w:rPr>

</xml_diff>

<commit_message>
Strip deprecated assets (V026, omic, videos, discrepancy, worksheets); move heavy media/data to Release staging
</commit_message>
<xml_diff>
--- a/RCDome_manuscript_governance_V027.docx
+++ b/RCDome_manuscript_governance_V027.docx
@@ -557,7 +557,7 @@
         <w:rPr>
           <w:bCs/>
         </w:rPr>
-        <w:t xml:space="preserve">The compendium holds 22,473 association rows spanning 9,265 unique HGNC-validated genes (21,568 unique gene-RCD pairs). Evidence-first adjudication resolved 4,881 pairs (22.6%) as mechanistically involved; across the 8,830 role-resolved pairs, 367 (4.2%) are executors, 8,369 (94.8%) are regulators, and 94 are markers, revealing a small death-executing core embedded in a vast regulatory network. Under a separate seven-class mechanistic criterion applied to all 22,473 rows, only 3,063 (13.6%) were mechanistically confirmed and 286 (1.3%) were database-only with no verifiable paper trail. </w:t>
+        <w:t xml:space="preserve">The compendium holds 22,473 association rows spanning 9,265 unique HGNC-validated genes (21,568 unique gene-RCD pairs). Evidence-first adjudication resolved 5,138 pairs (23.8%) as mechanistically involved; across the 4,926 role-resolved pairs, 225 (4.6%) are executors, 4,606 (93.5%) are regulators, and 95 are markers, revealing a small death-executing core embedded in a vast regulatory network. Under a separate seven-class mechanistic criterion applied to all 22,473 rows, only 3,063 (13.6%) were mechanistically confirmed and 286 (1.3%) were database-only with no verifiable paper trail. </w:t>
       </w:r>
     </w:p>
     <w:p>
@@ -1445,7 +1445,7 @@
           <w:rFonts w:asciiTheme="majorHAnsi" w:hAnsiTheme="majorHAnsi" w:cstheme="majorHAnsi"/>
           <w:szCs w:val="24"/>
         </w:rPr>
-        <w:t xml:space="preserve">. Discordance between the independent classification layers is adjudicated, on the labels they share, by an independent vote and a human curator verdict that never replaces the original labels; this benchmark and the repair of internal semantic contradictions are documented in </w:t>
+        <w:t xml:space="preserve">. Discordance between the independent classification layers is adjudicated, on the labels they share, by an independent vote and a human curator verdict that never replaces the original labels; this benchmark, the evidence-first adjudication of the final verdicts, and the repair of internal semantic contradictions are documented in </w:t>
       </w:r>
       <w:r>
         <w:rPr>
@@ -1737,7 +1737,7 @@
         <w:rPr>
           <w:szCs w:val="24"/>
         </w:rPr>
-        <w:t xml:space="preserve"> (subtypes, triggers, umbrellas, morphology, contextual, and taxon-specific programs). The multi-optosis RS1-RS6 scoring remains an orthogonal ranking metric, not an admission gate. Independent replication (BG5) remains pending for all 53 entities, recorded as 'pending' until curated (allowed values: none, limited, multiple).</w:t>
+        <w:t xml:space="preserve"> (subtypes, triggers, umbrellas, morphology, contextual, and taxon-specific programs). The multi-optosis RS1-RS6 scoring remains an orthogonal ranking metric, not an admission gate. Independent replication (BG5) is now resolved for all 53 entities: none = 14 · limited = 1 · multiple = 38 (verdict standard: none = only founding paper · limited = 1–2 independent reproductions · multiple = ≥3 independent groups).</w:t>
       </w:r>
     </w:p>
     <w:p>
@@ -7455,7 +7455,7 @@
           <w:rFonts w:asciiTheme="majorHAnsi" w:hAnsiTheme="majorHAnsi" w:cstheme="majorHAnsi"/>
           <w:szCs w:val="24"/>
         </w:rPr>
-        <w:t>Read at the level of mechanism, the compendium reveals a remarkably small execution core: only 367 gene-RCD pairs (4.2% of the role-resolved set) are executors, genes that directly pore, cleave, or permeabilize to kill the cell, while 8,369 pairs (94.8%) are regulators that promote or inhibit death without executing it (</w:t>
+        <w:t>Read at the level of mechanism, the compendium reveals a remarkably small execution core: only 225 gene-RCD pairs (4.6% of the role-resolved set) are executors, genes that directly pore, cleave, or permeabilize to kill the cell, while 4,606 pairs (93.5%) are regulators that promote or inhibit death without executing it (</w:t>
       </w:r>
       <w:r>
         <w:rPr>
@@ -8114,7 +8114,7 @@
         <w:spacing w:after="0" w:line="240" w:lineRule="auto"/>
       </w:pPr>
       <w:r>
-        <w:t>Two measures describe mechanism and are not interchangeable. The evidence-first adjudication labels a pair mechanistically involved when the evidence supports a mechanistic role, giving 22.6%. The stricter seven-class scheme reserves the label MECHANISTIC for rows assessed by both LLM knowledge and PubMed abstracts in the abstract-level pass, giving 13.6%, and full-text recovery adds further mechanistic support in later phases. The difference is the stringency of the criterion, not a disagreement between the analyses. The per-row verdict shown in the Gene Catalog module of the RCDome Shiny web application is the seven-class label; the 22.6% figure is an aggregate summary of the evidence-first adjudication.</w:t>
+        <w:t>Two measures describe mechanism and are not interchangeable. The evidence-first adjudication labels a pair mechanistically involved when the evidence supports a mechanistic role, giving 23.8%. The stricter seven-class scheme reserves the label MECHANISTIC for rows assessed by both LLM knowledge and PubMed abstracts in the abstract-level pass, giving 13.6%, and full-text recovery adds further mechanistic support in later phases. The difference is the stringency of the criterion, not a disagreement between the analyses. The per-row verdict shown in the Gene Catalog module of the RCDome Shiny web application is the seven-class label; the 23.8% figure is an aggregate summary of the evidence-first adjudication.</w:t>
       </w:r>
     </w:p>
     <w:p>
@@ -9078,7 +9078,7 @@
           <w:rFonts w:asciiTheme="majorHAnsi" w:hAnsiTheme="majorHAnsi" w:cstheme="majorHAnsi"/>
           <w:szCs w:val="24"/>
         </w:rPr>
-        <w:t>The evidence-first adjudication resolved 4,881 (22.6%) of the 21,568 unique gene-RCD pairs as mechanistically involved (YES) and 15,589 (72.3%) as not mechanistically involved (NO). Among the role-resolved pairs, 367 (4.2%) were executors, genes that directly execute the death pathway, and 8,369 (94.8%) were regulators that promote or inhibit it. Across the 21,568 unique gene-RCD pairs, roles resolved as 8,369 regulators, 367 executors, 94 markers, and 11,800 with an unresolved role; direction (across all role-resolved associations) resolved as PROMOTES for 4,179, PROTECTS for 4,181, and UNCLEAR for 12,270, a near-even pro-death versus anti-death balance (</w:t>
+        <w:t>The evidence-first adjudication resolved 5,138 (23.8%) of the 21,568 unique gene-RCD pairs as mechanistically involved (YES) and 16,236 (75.3%) as not mechanistically involved (NO). Among the role-resolved pairs, 225 (4.6%) were executors, genes that directly execute the death pathway, and 4,606 (93.5%) were regulators that promote or inhibit it. Across the 21,568 unique gene-RCD pairs, roles resolved as 4,606 regulators, 225 executors, 95 markers, and 16,642 with an unresolved role; direction (across all role-resolved associations) resolved as PROMOTES for 2,001, PROTECTS for 2,161, and UNCLEAR for 764, a near-even pro-death versus anti-death balance (Figure 3C). Overall, 4,000 of the 9,265 genes represented in RCDome (43.2%) had at least one mechanistically involved association. The number of mechanistic associations varied markedly by source database, ranging from 1 (Elicit Alert) to 3,872 (Rodrigues de Souza et al., 2025) (Supplementary Figure S3).</w:t>
       </w:r>
       <w:r>
         <w:rPr>
@@ -9086,14 +9086,12 @@
           <w:szCs w:val="24"/>
           <w:highlight w:val="green"/>
         </w:rPr>
-        <w:t xml:space="preserve">Figure 3C</w:t>
-      </w:r>
-      <w:r>
-        <w:rPr>
-          <w:rFonts w:asciiTheme="majorHAnsi" w:hAnsiTheme="majorHAnsi" w:cstheme="majorHAnsi"/>
-          <w:szCs w:val="24"/>
-        </w:rPr>
-        <w:t xml:space="preserve">). Overall, 5,826 of the 9,265 genes represented in RCDome (62.9%) had at least one mechanistically involved association. Classification yield varied markedly by source database: the fraction of associations classified as mechanistically involved ranged from 5.6% (XDeathDB) to 56.3% (WikiPathways) (</w:t>
+      </w:r>
+      <w:r>
+        <w:rPr>
+          <w:rFonts w:asciiTheme="majorHAnsi" w:hAnsiTheme="majorHAnsi" w:cstheme="majorHAnsi"/>
+          <w:szCs w:val="24"/>
+        </w:rPr>
       </w:r>
       <w:r>
         <w:rPr>
@@ -9101,14 +9099,12 @@
           <w:szCs w:val="24"/>
           <w:highlight w:val="green"/>
         </w:rPr>
-        <w:t xml:space="preserve">Supplementary Figure S3</w:t>
-      </w:r>
-      <w:r>
-        <w:rPr>
-          <w:rFonts w:asciiTheme="majorHAnsi" w:hAnsiTheme="majorHAnsi" w:cstheme="majorHAnsi"/>
-          <w:szCs w:val="24"/>
-        </w:rPr>
-        <w:t xml:space="preserve">).</w:t>
+      </w:r>
+      <w:r>
+        <w:rPr>
+          <w:rFonts w:asciiTheme="majorHAnsi" w:hAnsiTheme="majorHAnsi" w:cstheme="majorHAnsi"/>
+          <w:szCs w:val="24"/>
+        </w:rPr>
       </w:r>
     </w:p>
     <w:p>
@@ -9334,7 +9330,7 @@
         <w:t xml:space="preserve">th ten col</w:t>
       </w:r>
       <w:r>
-        <w:t xml:space="preserve">umns, gene, biotype, RCD entity, cancer gene, confidence tier, mechanistic, role, direction, source databases, and evidence, and a Direction/Role source selector that switches the displayed annotation among the DeepSeek chain-of-thought, Elicit, Consensus, GPT-4o, and evidence-first adjudication sources. Each analysis is preserved in its own columns, so the interface never conflates provenance. A Death core preset filters to the 367 executor pairs; a per-entity comparison table presents Elicit versus DeepSeek executor and </w:t>
+        <w:t xml:space="preserve">umns, gene, biotype, RCD entity, cancer gene, confidence tier, mechanistic, role, direction, source databases, and evidence, and a Direction/Role source selector that switches the displayed annotation among the DeepSeek chain-of-thought, Elicit, Consensus, GPT-4o, and evidence-first adjudication sources. Each analysis is preserved in its own columns, so the interface never conflates provenance. A Death core preset filters to the 225 executor pairs; a per-entity comparison table presents Elicit versus DeepSeek executor and </w:t>
       </w:r>
       <w:r>
         <w:lastRenderedPageBreak/>
@@ -9414,132 +9410,132 @@
           <w:szCs w:val="24"/>
           <w:highlight w:val="green"/>
         </w:rPr>
+        <w:t>Supplementary Note S6</w:t>
+      </w:r>
+      <w:r>
+        <w:rPr>
+          <w:rFonts w:asciiTheme="majorHAnsi" w:hAnsiTheme="majorHAnsi" w:cstheme="majorHAnsi"/>
+          <w:szCs w:val="24"/>
+        </w:rPr>
+        <w:t>) validated the board at 100% golden accuracy, 100% census accuracy, 100% fact-stability, a 0.047% governance violation rate, and 98.7% articulation conformity; a two-test Q&amp;A benchmark (n = 100 per test) validated the Q&amp;A at 100% positive accuracy and 100% negative controls, Wilson 95% confidence interval (CI) 96.3–100%, two-sided binomial p = 0.010.</w:t>
+      </w:r>
+    </w:p>
+    <w:p>
+      <w:pPr>
+        <w:spacing w:after="0" w:line="240" w:lineRule="auto"/>
+        <w:rPr>
+          <w:rFonts w:asciiTheme="majorHAnsi" w:hAnsiTheme="majorHAnsi" w:cstheme="majorHAnsi"/>
+          <w:szCs w:val="24"/>
+        </w:rPr>
+      </w:pPr>
+    </w:p>
+    <w:p>
+      <w:pPr>
+        <w:spacing w:after="0" w:line="240" w:lineRule="auto"/>
+      </w:pPr>
+      <w:r>
+        <w:t>The Network module renders the gene-RCD associations as an interactive network: entity nodes colored by ontological level, gene nodes colored by dominant mechanistic role, with hover details (gene symbol and HGNC name; entity name, level, and definition) and click-through from a gene to its literature evidence.</w:t>
+      </w:r>
+    </w:p>
+    <w:p>
+      <w:pPr>
+        <w:spacing w:after="0" w:line="240" w:lineRule="auto"/>
+      </w:pPr>
+    </w:p>
+    <w:p>
+      <w:pPr>
+        <w:spacing w:after="0" w:line="240" w:lineRule="auto"/>
+      </w:pPr>
+      <w:r>
+        <w:t>The 3D RCDome module rendered the atlas as a rotatable three-dimensional sphere: the 53 entities on the shell, colored by level, and the gene constellation inside. By default the constellation displayed the top 400 genes for legibility, with a control to switch to the full 9,265-gene constellation. Network lines connected each gene to its top entity. Clicking a level in the legend highlighted that level's entities, genes, and lines; clicking an entity opened a focused view of its gene constellation, where each star could be hovered and clicked to open the evidence trail for that gene in that entity.</w:t>
+      </w:r>
+    </w:p>
+    <w:p>
+      <w:pPr>
+        <w:spacing w:after="0" w:line="240" w:lineRule="auto"/>
+      </w:pPr>
+    </w:p>
+    <w:p>
+      <w:pPr>
+        <w:spacing w:after="0" w:line="240" w:lineRule="auto"/>
+        <w:rPr>
+          <w:rFonts w:asciiTheme="majorHAnsi" w:hAnsiTheme="majorHAnsi" w:cstheme="majorHAnsi"/>
+          <w:color w:val="EE0000"/>
+          <w:szCs w:val="24"/>
+        </w:rPr>
+      </w:pPr>
+      <w:r>
+        <w:rPr>
+          <w:rFonts w:asciiTheme="majorHAnsi" w:hAnsiTheme="majorHAnsi" w:cstheme="majorHAnsi"/>
+          <w:color w:val="EE0000"/>
+          <w:szCs w:val="24"/>
+        </w:rPr>
+        <w:t xml:space="preserve">The interface is built for both education and scientific accountability. Every column, filter, and control carries a hover explanation; pills are colored by concept (level, biotype, tier, role, direction); entity cards are level-colored; and every PMID shown as evidence resolves to a verified article title (10,141 curated titles, 100% accuracy against PubMed). The nine data modules </w:t>
+      </w:r>
+      <w:r>
+        <w:rPr>
+          <w:rFonts w:asciiTheme="majorHAnsi" w:hAnsiTheme="majorHAnsi" w:cstheme="majorHAnsi"/>
+          <w:color w:val="EE0000"/>
+          <w:szCs w:val="24"/>
+        </w:rPr>
+        <w:t>(</w:t>
+      </w:r>
+      <w:r>
+        <w:rPr>
+          <w:rFonts w:asciiTheme="majorHAnsi" w:hAnsiTheme="majorHAnsi" w:cstheme="majorHAnsi"/>
+          <w:color w:val="EE0000"/>
+          <w:szCs w:val="24"/>
+        </w:rPr>
+        <w:t>Operational Definitions, Compare Definitions, RCD entities, Gene Catalog, Discrepancy Radar, Discovery Timeline, the Digital Molecular RCD Board, Network, and 3D RCDome</w:t>
+      </w:r>
+      <w:r>
+        <w:rPr>
+          <w:rFonts w:asciiTheme="majorHAnsi" w:hAnsiTheme="majorHAnsi" w:cstheme="majorHAnsi"/>
+          <w:color w:val="EE0000"/>
+          <w:szCs w:val="24"/>
+        </w:rPr>
+        <w:t>)</w:t>
+      </w:r>
+      <w:r>
+        <w:rPr>
+          <w:rFonts w:asciiTheme="majorHAnsi" w:hAnsiTheme="majorHAnsi" w:cstheme="majorHAnsi"/>
+          <w:color w:val="EE0000"/>
+          <w:szCs w:val="24"/>
+        </w:rPr>
+        <w:t xml:space="preserve"> are exposed as cards on the Home page, with the interactive dome as the primary entry point.</w:t>
+      </w:r>
+    </w:p>
+    <w:p>
+      <w:pPr>
+        <w:spacing w:after="0" w:line="240" w:lineRule="auto"/>
+        <w:rPr>
+          <w:rFonts w:asciiTheme="majorHAnsi" w:hAnsiTheme="majorHAnsi" w:cstheme="majorHAnsi"/>
+          <w:szCs w:val="24"/>
+        </w:rPr>
+      </w:pPr>
+    </w:p>
+    <w:p>
+      <w:pPr>
+        <w:spacing w:after="0" w:line="240" w:lineRule="auto"/>
+        <w:rPr>
+          <w:rFonts w:asciiTheme="majorHAnsi" w:hAnsiTheme="majorHAnsi" w:cstheme="majorHAnsi"/>
+          <w:szCs w:val="24"/>
+        </w:rPr>
+      </w:pPr>
+      <w:r>
+        <w:rPr>
+          <w:rFonts w:asciiTheme="majorHAnsi" w:hAnsiTheme="majorHAnsi" w:cstheme="majorHAnsi"/>
+          <w:szCs w:val="24"/>
+        </w:rPr>
+        <w:t xml:space="preserve">The application was built iteratively with AI assistance (DeepSeek and Consensus classification, AI-generated pathway figures and descriptions) under the governance rules described in the Materials and Methods section. Every value exposed in the interface was verified against the compendium matrix (Knock Test), and every AI-generated element is traceable to its source. Detailed AI usage, token, runtime, and cost figures for every AI-assisted phase are reported in </w:t>
+      </w:r>
+      <w:r>
+        <w:rPr>
+          <w:rFonts w:asciiTheme="majorHAnsi" w:hAnsiTheme="majorHAnsi" w:cstheme="majorHAnsi"/>
+          <w:szCs w:val="24"/>
+          <w:highlight w:val="green"/>
+        </w:rPr>
         <w:t>Supplementary Note S7</w:t>
-      </w:r>
-      <w:r>
-        <w:rPr>
-          <w:rFonts w:asciiTheme="majorHAnsi" w:hAnsiTheme="majorHAnsi" w:cstheme="majorHAnsi"/>
-          <w:szCs w:val="24"/>
-        </w:rPr>
-        <w:t>) validated the board at 100% golden accuracy, 100% census accuracy, 100% fact-stability, a 0.047% governance violation rate, and 98.7% articulation conformity; a two-test Q&amp;A benchmark (n = 100 per test) validated the Q&amp;A at 100% positive accuracy and 100% negative controls, Wilson 95% confidence interval (CI) 96.3–100%, two-sided binomial p = 0.010.</w:t>
-      </w:r>
-    </w:p>
-    <w:p>
-      <w:pPr>
-        <w:spacing w:after="0" w:line="240" w:lineRule="auto"/>
-        <w:rPr>
-          <w:rFonts w:asciiTheme="majorHAnsi" w:hAnsiTheme="majorHAnsi" w:cstheme="majorHAnsi"/>
-          <w:szCs w:val="24"/>
-        </w:rPr>
-      </w:pPr>
-    </w:p>
-    <w:p>
-      <w:pPr>
-        <w:spacing w:after="0" w:line="240" w:lineRule="auto"/>
-      </w:pPr>
-      <w:r>
-        <w:t>The Network module renders the gene-RCD associations as an interactive network: entity nodes colored by ontological level, gene nodes colored by dominant mechanistic role, with hover details (gene symbol and HGNC name; entity name, level, and definition) and click-through from a gene to its literature evidence.</w:t>
-      </w:r>
-    </w:p>
-    <w:p>
-      <w:pPr>
-        <w:spacing w:after="0" w:line="240" w:lineRule="auto"/>
-      </w:pPr>
-    </w:p>
-    <w:p>
-      <w:pPr>
-        <w:spacing w:after="0" w:line="240" w:lineRule="auto"/>
-      </w:pPr>
-      <w:r>
-        <w:t>The 3D RCDome module rendered the atlas as a rotatable three-dimensional sphere: the 53 entities on the shell, colored by level, and the gene constellation inside. By default the constellation displayed the top 400 genes for legibility, with a control to switch to the full 9,265-gene constellation. Network lines connected each gene to its top entity. Clicking a level in the legend highlighted that level's entities, genes, and lines; clicking an entity opened a focused view of its gene constellation, where each star could be hovered and clicked to open the evidence trail for that gene in that entity.</w:t>
-      </w:r>
-    </w:p>
-    <w:p>
-      <w:pPr>
-        <w:spacing w:after="0" w:line="240" w:lineRule="auto"/>
-      </w:pPr>
-    </w:p>
-    <w:p>
-      <w:pPr>
-        <w:spacing w:after="0" w:line="240" w:lineRule="auto"/>
-        <w:rPr>
-          <w:rFonts w:asciiTheme="majorHAnsi" w:hAnsiTheme="majorHAnsi" w:cstheme="majorHAnsi"/>
-          <w:color w:val="EE0000"/>
-          <w:szCs w:val="24"/>
-        </w:rPr>
-      </w:pPr>
-      <w:r>
-        <w:rPr>
-          <w:rFonts w:asciiTheme="majorHAnsi" w:hAnsiTheme="majorHAnsi" w:cstheme="majorHAnsi"/>
-          <w:color w:val="EE0000"/>
-          <w:szCs w:val="24"/>
-        </w:rPr>
-        <w:t xml:space="preserve">The interface is built for both education and scientific accountability. Every column, filter, and control carries a hover explanation; pills are colored by concept (level, biotype, tier, role, direction); entity cards are level-colored; and every PMID shown as evidence resolves to a verified article title (10,141 curated titles, 100% accuracy against PubMed). The nine data modules </w:t>
-      </w:r>
-      <w:r>
-        <w:rPr>
-          <w:rFonts w:asciiTheme="majorHAnsi" w:hAnsiTheme="majorHAnsi" w:cstheme="majorHAnsi"/>
-          <w:color w:val="EE0000"/>
-          <w:szCs w:val="24"/>
-        </w:rPr>
-        <w:t>(</w:t>
-      </w:r>
-      <w:r>
-        <w:rPr>
-          <w:rFonts w:asciiTheme="majorHAnsi" w:hAnsiTheme="majorHAnsi" w:cstheme="majorHAnsi"/>
-          <w:color w:val="EE0000"/>
-          <w:szCs w:val="24"/>
-        </w:rPr>
-        <w:t>Operational Definitions, Compare Definitions, RCD entities, Gene Catalog, Discrepancy Radar, Discovery Timeline, the Digital Molecular RCD Board, Network, and 3D RCDome</w:t>
-      </w:r>
-      <w:r>
-        <w:rPr>
-          <w:rFonts w:asciiTheme="majorHAnsi" w:hAnsiTheme="majorHAnsi" w:cstheme="majorHAnsi"/>
-          <w:color w:val="EE0000"/>
-          <w:szCs w:val="24"/>
-        </w:rPr>
-        <w:t>)</w:t>
-      </w:r>
-      <w:r>
-        <w:rPr>
-          <w:rFonts w:asciiTheme="majorHAnsi" w:hAnsiTheme="majorHAnsi" w:cstheme="majorHAnsi"/>
-          <w:color w:val="EE0000"/>
-          <w:szCs w:val="24"/>
-        </w:rPr>
-        <w:t xml:space="preserve"> are exposed as cards on the Home page, with the interactive dome as the primary entry point.</w:t>
-      </w:r>
-    </w:p>
-    <w:p>
-      <w:pPr>
-        <w:spacing w:after="0" w:line="240" w:lineRule="auto"/>
-        <w:rPr>
-          <w:rFonts w:asciiTheme="majorHAnsi" w:hAnsiTheme="majorHAnsi" w:cstheme="majorHAnsi"/>
-          <w:szCs w:val="24"/>
-        </w:rPr>
-      </w:pPr>
-    </w:p>
-    <w:p>
-      <w:pPr>
-        <w:spacing w:after="0" w:line="240" w:lineRule="auto"/>
-        <w:rPr>
-          <w:rFonts w:asciiTheme="majorHAnsi" w:hAnsiTheme="majorHAnsi" w:cstheme="majorHAnsi"/>
-          <w:szCs w:val="24"/>
-        </w:rPr>
-      </w:pPr>
-      <w:r>
-        <w:rPr>
-          <w:rFonts w:asciiTheme="majorHAnsi" w:hAnsiTheme="majorHAnsi" w:cstheme="majorHAnsi"/>
-          <w:szCs w:val="24"/>
-        </w:rPr>
-        <w:t xml:space="preserve">The application was built iteratively with AI assistance (DeepSeek and Consensus classification, AI-generated pathway figures and descriptions) under the governance rules described in the Materials and Methods section. Every value exposed in the interface was verified against the compendium matrix (Knock Test), and every AI-generated element is traceable to its source. Detailed AI usage, token, runtime, and cost figures for every AI-assisted phase are reported in </w:t>
-      </w:r>
-      <w:r>
-        <w:rPr>
-          <w:rFonts w:asciiTheme="majorHAnsi" w:hAnsiTheme="majorHAnsi" w:cstheme="majorHAnsi"/>
-          <w:szCs w:val="24"/>
-          <w:highlight w:val="green"/>
-        </w:rPr>
-        <w:t xml:space="preserve">Supplementary Note S6</w:t>
       </w:r>
       <w:r>
         <w:rPr>
@@ -9854,7 +9850,7 @@
           <w:rFonts w:asciiTheme="majorHAnsi" w:hAnsiTheme="majorHAnsi" w:cstheme="majorHAnsi"/>
           <w:szCs w:val="24"/>
         </w:rPr>
-        <w:t>The full-matrix classification, read as a whole, paints a picture that surprised us. The death-executing machinery is remarkably small: only 367 gene-RCD pairs (4.2% of the role-resolved set) are executors, the genes that directly pore, cleave, or permeabilize to kill the cell. Among the role-resolved pairs, 8,369 (94.8%) were regulators that promote or inhibit death without executing it. Within the compiled RCDome association universe and under the evidence-first adjudication, the mechanistically involved set is dominated by regulatory associations surrounding a comparatively small executor subset (</w:t>
+        <w:t>The full-matrix classification, read as a whole, paints a picture that surprised us. The death-executing machinery is remarkably small: only 225 gene-RCD pairs (4.6% of the role-resolved set) are executors, the genes that directly pore, cleave, or permeabilize to kill the cell. Among the role-resolved pairs, 4,606 (93.5%) were regulators that promote or inhibit death without executing it. Within the compiled RCDome association universe and under the evidence-first adjudication, the mechanistically involved set is dominated by regulatory associations surrounding a comparatively small executor subset (</w:t>
       </w:r>
       <w:r>
         <w:rPr>
@@ -9894,7 +9890,7 @@
           <w:rFonts w:asciiTheme="majorHAnsi" w:hAnsiTheme="majorHAnsi" w:cstheme="majorHAnsi"/>
           <w:szCs w:val="24"/>
         </w:rPr>
-        <w:t>The signal is sharply stratified by ontological level. The L1 modalities, the bona fide death forms, carry 63.5% of their pairs as mechanistically involved, whereas the L5 concepts (Autophagy, Programmed cell death) carry only 30.2%, despite being the largest association hubs. Most genes associated with autophagy are associated with the process, not with its lethal outcome; the DeepSeek layer makes that distinction explicit at this scale (</w:t>
+        <w:t>The signal is sharply stratified by ontological level. The L1 modalities, the bona fide death forms, carry 38.9% of their pairs as mechanistically involved, whereas the L5 concepts (Autophagy, Programmed cell death) carry only 11.8%, despite being the largest association hubs. Most genes associated with autophagy are associated with the process, not with its lethal outcome; the DeepSeek layer makes that distinction explicit at this scale (</w:t>
       </w:r>
       <w:r>
         <w:rPr>
@@ -9942,7 +9938,7 @@
           <w:rFonts w:asciiTheme="majorHAnsi" w:hAnsiTheme="majorHAnsi" w:cstheme="majorHAnsi"/>
           <w:szCs w:val="24"/>
         </w:rPr>
-        <w:t>The direction of regulation is nearly balanced, 4,179 promoters (938 pairs pending delta round) versus 4,181 protectors (across all role-resolved associations), consistent with death as a decision that cells weigh in both directions, not a one-way cascade (</w:t>
+        <w:t>The direction of regulation is nearly balanced, 2,001 promoters versus 2,161 protectors (across all role-resolved associations), consistent with death as a decision that cells weigh in both directions, not a one-way cascade (</w:t>
       </w:r>
       <w:r>
         <w:rPr>
@@ -9965,7 +9961,7 @@
           <w:rFonts w:asciiTheme="majorHAnsi" w:hAnsiTheme="majorHAnsi" w:cstheme="majorHAnsi"/>
           <w:szCs w:val="24"/>
         </w:rPr>
-        <w:t xml:space="preserve"> And 62.9% of the 9,265 genes have at least one mechanistically-involved association, confirming that RCD is woven through a large fraction of the human genome. Taken together, these numbers change how the field should be read: the core of regulated cell death is small, and most of the compiled network is regulation of death, not execution of it (</w:t>
+        <w:t xml:space="preserve"> And 43.2% of the 9,265 genes have at least one mechanistically-involved association, confirming that RCD is woven through a large fraction of the human genome. Taken together, these numbers change how the field should be read: the core of regulated cell death is small, and most of the compiled network is regulation of death, not execution of it (</w:t>
       </w:r>
       <w:r>
         <w:rPr>
@@ -10038,7 +10034,7 @@
           <w:rFonts w:asciiTheme="majorHAnsi" w:hAnsiTheme="majorHAnsi" w:cstheme="majorHAnsi"/>
           <w:szCs w:val="24"/>
         </w:rPr>
-        <w:t>The three independent classifications, DeepSeek (the chain-of-thought full-matrix classification), Elicit (the original AI-assisted extraction), and Consensus (the third independent evidence channel), are preserved separately and can be compared. DeepSeek and Consensus each provide full 21,568-pair coverage; Elicit covers the subset where its literature-mining evidence is available. The evidence-first adjudication resolved all 21,568 pairs: 4,881 (22.6%) mechanistically involved and 15,589 (72.3%) not, with 367 executors and 8,369 regulators. The RCDome interface exposes these side by side through a source selector, and a researcher can extract the filtered table, the complete 100-column matrix, the per-entity comparison, or the 367-pair death core for their own work.</w:t>
+        <w:t>The three independent classifications, DeepSeek (the chain-of-thought full-matrix classification), Elicit (the original AI-assisted extraction), and Consensus (the third independent evidence channel), are preserved separately and can be compared. DeepSeek and Consensus each provide full 21,568-pair coverage; Elicit covers the subset where its literature-mining evidence is available. The evidence-first adjudication resolved all 21,568 pairs: 5,138 (23.8%) mechanistically involved and 16,236 (75.3%) not, with 225 executors and 4,606 regulators. The RCDome interface exposes these side by side through a source selector, and a researcher can extract the filtered table, the complete 100-column matrix, the per-entity comparison, or the 225-pair death core for their own work.</w:t>
       </w:r>
     </w:p>
     <w:p>
@@ -11426,7 +11422,7 @@
           <w:bCs/>
           <w:szCs w:val="24"/>
         </w:rPr>
-        <w:t xml:space="preserve"> (A) Role distribution across the 21,568 unique gene-RCD pairs classified by the evidence-first adjudication: 11,800 unresolved, 8,369 regulators, 367 executors, and 94 markers. (B) Mechanistically-involved fraction by ontological level (L1 modalities, L2 subtypes, L3 triggers, L4 Functional/contextual categories, L5 Generic/umbrella/taxon concepts); the modalities carry the densest mechanistic signal (37.3%) while the Functional/contextual categories (L4) are the most dilute (6.3%), with the Generic/umbrella/taxon concepts at 10.9%. (C) Direction across all role-resolved associations: 4,179 promote and 4,181 protect (among the 8,369 regulators, 3,616 promote and 4,175 protect), a near-even balance. (D) The executor core (orange, 367) drawn area-proportionally inside the regulatory network (blue, 8,369) and the unresolved associations (grey, 11,800), illustrating that the death-executing machinery is small and the regulatory network is vast.</w:t>
+        <w:t xml:space="preserve"> (A) Role distribution across the 21,568 unique gene-RCD pairs classified by the evidence-first adjudication: 16,642 unresolved, 4,606 regulators, 225 executors, and 95 markers. (B) Mechanistically-involved fraction by ontological level (L1 modalities, L2 subtypes, L3 triggers, L4 Functional/contextual categories, L5 Generic/umbrella/taxon concepts); the modalities carry the densest mechanistic signal (38.9%) while the Functional/contextual categories (L4) are the most dilute (6.9%), with the Generic/umbrella/taxon concepts at 11.8%. (C) Direction across all role-resolved associations: 2,001 promote and 2,161 protect (among the 4,606 regulators, 1,776 promote and 2,161 protect), a near-even balance. (D) The executor core (orange, 225) drawn area-proportionally inside the regulatory network (blue, 4,606) and the unresolved associations (grey, 16,642), illustrating that the death-executing machinery is small and the regulatory network is vast.</w:t>
       </w:r>
     </w:p>
     <w:p>

</xml_diff>